<commit_message>
Add human-in-the-loop fallback requirements
</commit_message>
<xml_diff>
--- a/outputs/工序AI助手_PRD_正式版.docx
+++ b/outputs/工序AI助手_PRD_正式版.docx
@@ -977,6 +977,70 @@
                 <w:sz w:val="19"/>
               </w:rPr>
               <w:t>AI 从自然语言中抽取的业务参数，如项目、桩号、工程部位、时间范围、统计层级、人员等。</w:t>
+            </w:r>
+          </w:p>
+        </w:tc>
+      </w:tr>
+      <w:tr>
+        <w:tc>
+          <w:tcPr>
+            <w:tcW w:type="dxa" w:w="4968"/>
+          </w:tcPr>
+          <w:p>
+            <w:r>
+              <w:rPr>
+                <w:rFonts w:ascii="宋体" w:hAnsi="宋体" w:eastAsia="宋体"/>
+                <w:b w:val="0"/>
+                <w:sz w:val="19"/>
+              </w:rPr>
+              <w:t>人在回路</w:t>
+            </w:r>
+          </w:p>
+        </w:tc>
+        <w:tc>
+          <w:tcPr>
+            <w:tcW w:type="dxa" w:w="4968"/>
+          </w:tcPr>
+          <w:p>
+            <w:r>
+              <w:rPr>
+                <w:rFonts w:ascii="宋体" w:hAnsi="宋体" w:eastAsia="宋体"/>
+                <w:b w:val="0"/>
+                <w:sz w:val="19"/>
+              </w:rPr>
+              <w:t>AI 无法确定结果、结果置信度低、候选冲突或涉及正式写入时，由用户或授权人员完成确认、修正、补录、人工绑定或转人工办理的闭环机制。</w:t>
+            </w:r>
+          </w:p>
+        </w:tc>
+      </w:tr>
+      <w:tr>
+        <w:tc>
+          <w:tcPr>
+            <w:tcW w:type="dxa" w:w="4968"/>
+          </w:tcPr>
+          <w:p>
+            <w:r>
+              <w:rPr>
+                <w:rFonts w:ascii="宋体" w:hAnsi="宋体" w:eastAsia="宋体"/>
+                <w:b w:val="0"/>
+                <w:sz w:val="19"/>
+              </w:rPr>
+              <w:t>人工兜底</w:t>
+            </w:r>
+          </w:p>
+        </w:tc>
+        <w:tc>
+          <w:tcPr>
+            <w:tcW w:type="dxa" w:w="4968"/>
+          </w:tcPr>
+          <w:p>
+            <w:r>
+              <w:rPr>
+                <w:rFonts w:ascii="宋体" w:hAnsi="宋体" w:eastAsia="宋体"/>
+                <w:b w:val="0"/>
+                <w:sz w:val="19"/>
+              </w:rPr>
+              <w:t>AI、RAG、OCR、工具调用或模型服务无法给出可靠结果时，系统保留原人工业务路径，并记录失败原因、人工处理结果和审计信息。</w:t>
             </w:r>
           </w:p>
         </w:tc>
@@ -1189,6 +1253,20 @@
     </w:p>
     <w:p>
       <w:pPr>
+        <w:pStyle w:val="ListNumber"/>
+        <w:spacing w:before="0" w:after="80" w:line="360" w:lineRule="auto"/>
+      </w:pPr>
+      <w:r>
+        <w:rPr>
+          <w:rFonts w:ascii="宋体" w:hAnsi="宋体" w:eastAsia="宋体"/>
+          <w:b w:val="0"/>
+          <w:sz w:val="21"/>
+        </w:rPr>
+        <w:t>建立人在回路和人工兜底机制：当意图识别、槽位抽取、RAG 检索、OCR 识别、候选匹配或工具调用无法形成可靠结果时，系统必须停止自动推进，并引导用户确认、修正、补录、人工绑定或转入既有人工办理流程。</w:t>
+      </w:r>
+    </w:p>
+    <w:p>
+      <w:pPr>
         <w:pStyle w:val="Heading3"/>
         <w:jc w:val="left"/>
       </w:pPr>
@@ -1463,6 +1541,70 @@
                 <w:sz w:val="19"/>
               </w:rPr>
               <w:t>AI 服务异常不得影响人工业务主流程。</w:t>
+            </w:r>
+          </w:p>
+        </w:tc>
+      </w:tr>
+      <w:tr>
+        <w:tc>
+          <w:tcPr>
+            <w:tcW w:type="dxa" w:w="4968"/>
+          </w:tcPr>
+          <w:p>
+            <w:r>
+              <w:rPr>
+                <w:rFonts w:ascii="宋体" w:hAnsi="宋体" w:eastAsia="宋体"/>
+                <w:b w:val="0"/>
+                <w:sz w:val="19"/>
+              </w:rPr>
+              <w:t>低置信拦截</w:t>
+            </w:r>
+          </w:p>
+        </w:tc>
+        <w:tc>
+          <w:tcPr>
+            <w:tcW w:type="dxa" w:w="4968"/>
+          </w:tcPr>
+          <w:p>
+            <w:r>
+              <w:rPr>
+                <w:rFonts w:ascii="宋体" w:hAnsi="宋体" w:eastAsia="宋体"/>
+                <w:b w:val="0"/>
+                <w:sz w:val="19"/>
+              </w:rPr>
+              <w:t>低置信度、无结果、多候选冲突、字段缺失场景不得自动写入业务结果。</w:t>
+            </w:r>
+          </w:p>
+        </w:tc>
+      </w:tr>
+      <w:tr>
+        <w:tc>
+          <w:tcPr>
+            <w:tcW w:type="dxa" w:w="4968"/>
+          </w:tcPr>
+          <w:p>
+            <w:r>
+              <w:rPr>
+                <w:rFonts w:ascii="宋体" w:hAnsi="宋体" w:eastAsia="宋体"/>
+                <w:b w:val="0"/>
+                <w:sz w:val="19"/>
+              </w:rPr>
+              <w:t>人工兜底闭环</w:t>
+            </w:r>
+          </w:p>
+        </w:tc>
+        <w:tc>
+          <w:tcPr>
+            <w:tcW w:type="dxa" w:w="4968"/>
+          </w:tcPr>
+          <w:p>
+            <w:r>
+              <w:rPr>
+                <w:rFonts w:ascii="宋体" w:hAnsi="宋体" w:eastAsia="宋体"/>
+                <w:b w:val="0"/>
+                <w:sz w:val="19"/>
+              </w:rPr>
+              <w:t>进入人工兜底的任务必须可继续办理、可查询状态、可追溯原因和最终处理结果。</w:t>
             </w:r>
           </w:p>
         </w:tc>
@@ -2671,6 +2813,68 @@
                 <w:sz w:val="19"/>
               </w:rPr>
               <w:t>清晰提示无法办理原因，保留人工处理路径。</w:t>
+            </w:r>
+          </w:p>
+        </w:tc>
+      </w:tr>
+      <w:tr>
+        <w:tc>
+          <w:tcPr>
+            <w:tcW w:type="dxa" w:w="2484"/>
+          </w:tcPr>
+          <w:p>
+            <w:r>
+              <w:rPr>
+                <w:rFonts w:ascii="宋体" w:hAnsi="宋体" w:eastAsia="宋体"/>
+                <w:b w:val="0"/>
+                <w:sz w:val="19"/>
+              </w:rPr>
+              <w:t>Scene-009</w:t>
+            </w:r>
+          </w:p>
+        </w:tc>
+        <w:tc>
+          <w:tcPr>
+            <w:tcW w:type="dxa" w:w="2484"/>
+          </w:tcPr>
+          <w:p>
+            <w:r>
+              <w:rPr>
+                <w:rFonts w:ascii="宋体" w:hAnsi="宋体" w:eastAsia="宋体"/>
+                <w:b w:val="0"/>
+                <w:sz w:val="19"/>
+              </w:rPr>
+              <w:t>人在回路与人工兜底</w:t>
+            </w:r>
+          </w:p>
+        </w:tc>
+        <w:tc>
+          <w:tcPr>
+            <w:tcW w:type="dxa" w:w="2484"/>
+          </w:tcPr>
+          <w:p>
+            <w:r>
+              <w:rPr>
+                <w:rFonts w:ascii="宋体" w:hAnsi="宋体" w:eastAsia="宋体"/>
+                <w:b w:val="0"/>
+                <w:sz w:val="19"/>
+              </w:rPr>
+              <w:t>验收申请、检查记录、OCR确认页、AI会话错误卡</w:t>
+            </w:r>
+          </w:p>
+        </w:tc>
+        <w:tc>
+          <w:tcPr>
+            <w:tcW w:type="dxa" w:w="2484"/>
+          </w:tcPr>
+          <w:p>
+            <w:r>
+              <w:rPr>
+                <w:rFonts w:ascii="宋体" w:hAnsi="宋体" w:eastAsia="宋体"/>
+                <w:b w:val="0"/>
+                <w:sz w:val="19"/>
+              </w:rPr>
+              <w:t>当 AI 无法可靠识别、候选冲突、低置信度或工具失败时，用户可确认、修正、补录、人工绑定、转表单手工办理或转管理员处理。</w:t>
             </w:r>
           </w:p>
         </w:tc>
@@ -2819,6 +3023,20 @@
     </w:p>
     <w:p>
       <w:pPr>
+        <w:pStyle w:val="ListNumber"/>
+        <w:spacing w:before="0" w:after="80" w:line="360" w:lineRule="auto"/>
+      </w:pPr>
+      <w:r>
+        <w:rPr>
+          <w:rFonts w:ascii="宋体" w:hAnsi="宋体" w:eastAsia="宋体"/>
+          <w:b w:val="0"/>
+          <w:sz w:val="21"/>
+        </w:rPr>
+        <w:t>作为现场作业人员，当 AI 无法识别我的验收或检查请求、识别错误或置信度较低时，我想看到明确原因和可操作的人工处理入口，以便继续完成验收申请、检查记录或资料挂接。</w:t>
+      </w:r>
+    </w:p>
+    <w:p>
+      <w:pPr>
         <w:pStyle w:val="Heading2"/>
         <w:jc w:val="left"/>
       </w:pPr>
@@ -3369,6 +3587,53 @@
                 <w:sz w:val="19"/>
               </w:rPr>
               <w:t>权限映射、工具白名单、日志审计、配置版本、失败兜底。</w:t>
+            </w:r>
+          </w:p>
+        </w:tc>
+      </w:tr>
+      <w:tr>
+        <w:tc>
+          <w:tcPr>
+            <w:tcW w:type="dxa" w:w="3312"/>
+          </w:tcPr>
+          <w:p>
+            <w:r>
+              <w:rPr>
+                <w:rFonts w:ascii="宋体" w:hAnsi="宋体" w:eastAsia="宋体"/>
+                <w:b w:val="0"/>
+                <w:sz w:val="19"/>
+              </w:rPr>
+              <w:t>Scope-011</w:t>
+            </w:r>
+          </w:p>
+        </w:tc>
+        <w:tc>
+          <w:tcPr>
+            <w:tcW w:type="dxa" w:w="3312"/>
+          </w:tcPr>
+          <w:p>
+            <w:r>
+              <w:rPr>
+                <w:rFonts w:ascii="宋体" w:hAnsi="宋体" w:eastAsia="宋体"/>
+                <w:b w:val="0"/>
+                <w:sz w:val="19"/>
+              </w:rPr>
+              <w:t>人在回路与人工兜底</w:t>
+            </w:r>
+          </w:p>
+        </w:tc>
+        <w:tc>
+          <w:tcPr>
+            <w:tcW w:type="dxa" w:w="3312"/>
+          </w:tcPr>
+          <w:p>
+            <w:r>
+              <w:rPr>
+                <w:rFonts w:ascii="宋体" w:hAnsi="宋体" w:eastAsia="宋体"/>
+                <w:b w:val="0"/>
+                <w:sz w:val="19"/>
+              </w:rPr>
+              <w:t>低置信度、无结果、多候选冲突、识别错误、工具失败时，支持用户确认、修改、补录、人工绑定、转人工办理和结果追溯。</w:t>
             </w:r>
           </w:p>
         </w:tc>
@@ -4750,6 +5015,1375 @@
     <w:p/>
     <w:p>
       <w:pPr>
+        <w:pStyle w:val="Heading3"/>
+        <w:jc w:val="left"/>
+      </w:pPr>
+      <w:r>
+        <w:rPr>
+          <w:rFonts w:ascii="宋体" w:hAnsi="宋体" w:eastAsia="宋体"/>
+          <w:b/>
+          <w:sz w:val="24"/>
+        </w:rPr>
+        <w:t>6.6 人在回路与人工兜底流程</w:t>
+      </w:r>
+    </w:p>
+    <w:p>
+      <w:pPr>
+        <w:spacing w:before="0" w:after="80" w:line="360" w:lineRule="auto"/>
+      </w:pPr>
+      <w:r>
+        <w:rPr>
+          <w:rFonts w:ascii="宋体" w:hAnsi="宋体" w:eastAsia="宋体"/>
+          <w:b w:val="0"/>
+          <w:sz w:val="21"/>
+        </w:rPr>
+        <w:t>人在回路不是异常之外的附加能力，而是 AI 助手办理验收申请、检查记录、OCR 填报和数据查询时的安全闭环。系统只在结果可靠、权限明确、字段完整且用户确认后继续推进；任一关键条件不满足时，必须转入人工确认、修正、补录或人工办理。</w:t>
+      </w:r>
+    </w:p>
+    <w:p>
+      <w:pPr>
+        <w:pStyle w:val="Heading4"/>
+        <w:jc w:val="left"/>
+      </w:pPr>
+      <w:r>
+        <w:rPr>
+          <w:rFonts w:ascii="宋体" w:hAnsi="宋体" w:eastAsia="宋体"/>
+          <w:b/>
+          <w:sz w:val="24"/>
+        </w:rPr>
+        <w:t>6.6.1 触发条件</w:t>
+      </w:r>
+    </w:p>
+    <w:tbl>
+      <w:tblPr>
+        <w:tblStyle w:val="TableGrid"/>
+        <w:tblW w:type="auto" w:w="0"/>
+        <w:tblLook w:firstColumn="1" w:firstRow="1" w:lastColumn="0" w:lastRow="0" w:noHBand="0" w:noVBand="1" w:val="04A0"/>
+      </w:tblPr>
+      <w:tblGrid>
+        <w:gridCol w:w="3312"/>
+        <w:gridCol w:w="3312"/>
+        <w:gridCol w:w="3312"/>
+      </w:tblGrid>
+      <w:tr>
+        <w:tc>
+          <w:tcPr>
+            <w:tcW w:type="dxa" w:w="3312"/>
+          </w:tcPr>
+          <w:p>
+            <w:r>
+              <w:rPr>
+                <w:rFonts w:ascii="宋体" w:hAnsi="宋体" w:eastAsia="宋体"/>
+                <w:b/>
+                <w:sz w:val="19"/>
+              </w:rPr>
+              <w:t>触发条件</w:t>
+            </w:r>
+          </w:p>
+        </w:tc>
+        <w:tc>
+          <w:tcPr>
+            <w:tcW w:type="dxa" w:w="3312"/>
+          </w:tcPr>
+          <w:p>
+            <w:r>
+              <w:rPr>
+                <w:rFonts w:ascii="宋体" w:hAnsi="宋体" w:eastAsia="宋体"/>
+                <w:b/>
+                <w:sz w:val="19"/>
+              </w:rPr>
+              <w:t>示例</w:t>
+            </w:r>
+          </w:p>
+        </w:tc>
+        <w:tc>
+          <w:tcPr>
+            <w:tcW w:type="dxa" w:w="3312"/>
+          </w:tcPr>
+          <w:p>
+            <w:r>
+              <w:rPr>
+                <w:rFonts w:ascii="宋体" w:hAnsi="宋体" w:eastAsia="宋体"/>
+                <w:b/>
+                <w:sz w:val="19"/>
+              </w:rPr>
+              <w:t>系统行为</w:t>
+            </w:r>
+          </w:p>
+        </w:tc>
+      </w:tr>
+      <w:tr>
+        <w:tc>
+          <w:tcPr>
+            <w:tcW w:type="dxa" w:w="3312"/>
+          </w:tcPr>
+          <w:p>
+            <w:r>
+              <w:rPr>
+                <w:rFonts w:ascii="宋体" w:hAnsi="宋体" w:eastAsia="宋体"/>
+                <w:b w:val="0"/>
+                <w:sz w:val="19"/>
+              </w:rPr>
+              <w:t>意图无法识别</w:t>
+            </w:r>
+          </w:p>
+        </w:tc>
+        <w:tc>
+          <w:tcPr>
+            <w:tcW w:type="dxa" w:w="3312"/>
+          </w:tcPr>
+          <w:p>
+            <w:r>
+              <w:rPr>
+                <w:rFonts w:ascii="宋体" w:hAnsi="宋体" w:eastAsia="宋体"/>
+                <w:b w:val="0"/>
+                <w:sz w:val="19"/>
+              </w:rPr>
+              <w:t>用户输入“帮我弄一下这个工序”</w:t>
+            </w:r>
+          </w:p>
+        </w:tc>
+        <w:tc>
+          <w:tcPr>
+            <w:tcW w:type="dxa" w:w="3312"/>
+          </w:tcPr>
+          <w:p>
+            <w:r>
+              <w:rPr>
+                <w:rFonts w:ascii="宋体" w:hAnsi="宋体" w:eastAsia="宋体"/>
+                <w:b w:val="0"/>
+                <w:sz w:val="19"/>
+              </w:rPr>
+              <w:t>展示可选任务类型：查指南、发起验收、生成检查记录、上传 OCR、查简报。</w:t>
+            </w:r>
+          </w:p>
+        </w:tc>
+      </w:tr>
+      <w:tr>
+        <w:tc>
+          <w:tcPr>
+            <w:tcW w:type="dxa" w:w="3312"/>
+          </w:tcPr>
+          <w:p>
+            <w:r>
+              <w:rPr>
+                <w:rFonts w:ascii="宋体" w:hAnsi="宋体" w:eastAsia="宋体"/>
+                <w:b w:val="0"/>
+                <w:sz w:val="19"/>
+              </w:rPr>
+              <w:t>必填槽位缺失</w:t>
+            </w:r>
+          </w:p>
+        </w:tc>
+        <w:tc>
+          <w:tcPr>
+            <w:tcW w:type="dxa" w:w="3312"/>
+          </w:tcPr>
+          <w:p>
+            <w:r>
+              <w:rPr>
+                <w:rFonts w:ascii="宋体" w:hAnsi="宋体" w:eastAsia="宋体"/>
+                <w:b w:val="0"/>
+                <w:sz w:val="19"/>
+              </w:rPr>
+              <w:t>缺项目、桩号、工程部位、验收/检查类型</w:t>
+            </w:r>
+          </w:p>
+        </w:tc>
+        <w:tc>
+          <w:tcPr>
+            <w:tcW w:type="dxa" w:w="3312"/>
+          </w:tcPr>
+          <w:p>
+            <w:r>
+              <w:rPr>
+                <w:rFonts w:ascii="宋体" w:hAnsi="宋体" w:eastAsia="宋体"/>
+                <w:b w:val="0"/>
+                <w:sz w:val="19"/>
+              </w:rPr>
+              <w:t>一次性汇总追问；达到追问上限后进入半预填表单或人工录入。</w:t>
+            </w:r>
+          </w:p>
+        </w:tc>
+      </w:tr>
+      <w:tr>
+        <w:tc>
+          <w:tcPr>
+            <w:tcW w:type="dxa" w:w="3312"/>
+          </w:tcPr>
+          <w:p>
+            <w:r>
+              <w:rPr>
+                <w:rFonts w:ascii="宋体" w:hAnsi="宋体" w:eastAsia="宋体"/>
+                <w:b w:val="0"/>
+                <w:sz w:val="19"/>
+              </w:rPr>
+              <w:t>槽位冲突</w:t>
+            </w:r>
+          </w:p>
+        </w:tc>
+        <w:tc>
+          <w:tcPr>
+            <w:tcW w:type="dxa" w:w="3312"/>
+          </w:tcPr>
+          <w:p>
+            <w:r>
+              <w:rPr>
+                <w:rFonts w:ascii="宋体" w:hAnsi="宋体" w:eastAsia="宋体"/>
+                <w:b w:val="0"/>
+                <w:sz w:val="19"/>
+              </w:rPr>
+              <w:t>用户输入项目A，页面上下文为项目B</w:t>
+            </w:r>
+          </w:p>
+        </w:tc>
+        <w:tc>
+          <w:tcPr>
+            <w:tcW w:type="dxa" w:w="3312"/>
+          </w:tcPr>
+          <w:p>
+            <w:r>
+              <w:rPr>
+                <w:rFonts w:ascii="宋体" w:hAnsi="宋体" w:eastAsia="宋体"/>
+                <w:b w:val="0"/>
+                <w:sz w:val="19"/>
+              </w:rPr>
+              <w:t>展示冲突来源，要求用户选择或切换上下文。</w:t>
+            </w:r>
+          </w:p>
+        </w:tc>
+      </w:tr>
+      <w:tr>
+        <w:tc>
+          <w:tcPr>
+            <w:tcW w:type="dxa" w:w="3312"/>
+          </w:tcPr>
+          <w:p>
+            <w:r>
+              <w:rPr>
+                <w:rFonts w:ascii="宋体" w:hAnsi="宋体" w:eastAsia="宋体"/>
+                <w:b w:val="0"/>
+                <w:sz w:val="19"/>
+              </w:rPr>
+              <w:t>多候选</w:t>
+            </w:r>
+          </w:p>
+        </w:tc>
+        <w:tc>
+          <w:tcPr>
+            <w:tcW w:type="dxa" w:w="3312"/>
+          </w:tcPr>
+          <w:p>
+            <w:r>
+              <w:rPr>
+                <w:rFonts w:ascii="宋体" w:hAnsi="宋体" w:eastAsia="宋体"/>
+                <w:b w:val="0"/>
+                <w:sz w:val="19"/>
+              </w:rPr>
+              <w:t>桩号匹配多个结构，人员姓名匹配多人</w:t>
+            </w:r>
+          </w:p>
+        </w:tc>
+        <w:tc>
+          <w:tcPr>
+            <w:tcW w:type="dxa" w:w="3312"/>
+          </w:tcPr>
+          <w:p>
+            <w:r>
+              <w:rPr>
+                <w:rFonts w:ascii="宋体" w:hAnsi="宋体" w:eastAsia="宋体"/>
+                <w:b w:val="0"/>
+                <w:sz w:val="19"/>
+              </w:rPr>
+              <w:t>最多展示 5 个候选；超过 5 个先追问缩小范围。</w:t>
+            </w:r>
+          </w:p>
+        </w:tc>
+      </w:tr>
+      <w:tr>
+        <w:tc>
+          <w:tcPr>
+            <w:tcW w:type="dxa" w:w="3312"/>
+          </w:tcPr>
+          <w:p>
+            <w:r>
+              <w:rPr>
+                <w:rFonts w:ascii="宋体" w:hAnsi="宋体" w:eastAsia="宋体"/>
+                <w:b w:val="0"/>
+                <w:sz w:val="19"/>
+              </w:rPr>
+              <w:t>低置信度</w:t>
+            </w:r>
+          </w:p>
+        </w:tc>
+        <w:tc>
+          <w:tcPr>
+            <w:tcW w:type="dxa" w:w="3312"/>
+          </w:tcPr>
+          <w:p>
+            <w:r>
+              <w:rPr>
+                <w:rFonts w:ascii="宋体" w:hAnsi="宋体" w:eastAsia="宋体"/>
+                <w:b w:val="0"/>
+                <w:sz w:val="19"/>
+              </w:rPr>
+              <w:t>OCR 字段模糊、RAG 无 Top1、模型低置信</w:t>
+            </w:r>
+          </w:p>
+        </w:tc>
+        <w:tc>
+          <w:tcPr>
+            <w:tcW w:type="dxa" w:w="3312"/>
+          </w:tcPr>
+          <w:p>
+            <w:r>
+              <w:rPr>
+                <w:rFonts w:ascii="宋体" w:hAnsi="宋体" w:eastAsia="宋体"/>
+                <w:b w:val="0"/>
+                <w:sz w:val="19"/>
+              </w:rPr>
+              <w:t>停止自动推进，展示原因、候选和人工入口。</w:t>
+            </w:r>
+          </w:p>
+        </w:tc>
+      </w:tr>
+      <w:tr>
+        <w:tc>
+          <w:tcPr>
+            <w:tcW w:type="dxa" w:w="3312"/>
+          </w:tcPr>
+          <w:p>
+            <w:r>
+              <w:rPr>
+                <w:rFonts w:ascii="宋体" w:hAnsi="宋体" w:eastAsia="宋体"/>
+                <w:b w:val="0"/>
+                <w:sz w:val="19"/>
+              </w:rPr>
+              <w:t>识别错误</w:t>
+            </w:r>
+          </w:p>
+        </w:tc>
+        <w:tc>
+          <w:tcPr>
+            <w:tcW w:type="dxa" w:w="3312"/>
+          </w:tcPr>
+          <w:p>
+            <w:r>
+              <w:rPr>
+                <w:rFonts w:ascii="宋体" w:hAnsi="宋体" w:eastAsia="宋体"/>
+                <w:b w:val="0"/>
+                <w:sz w:val="19"/>
+              </w:rPr>
+              <w:t>用户发现 AI 识别的桩号、责任人或工程部位错误</w:t>
+            </w:r>
+          </w:p>
+        </w:tc>
+        <w:tc>
+          <w:tcPr>
+            <w:tcW w:type="dxa" w:w="3312"/>
+          </w:tcPr>
+          <w:p>
+            <w:r>
+              <w:rPr>
+                <w:rFonts w:ascii="宋体" w:hAnsi="宋体" w:eastAsia="宋体"/>
+                <w:b w:val="0"/>
+                <w:sz w:val="19"/>
+              </w:rPr>
+              <w:t>允许用户直接修改，并记录 AI 原值、用户值和修改原因。</w:t>
+            </w:r>
+          </w:p>
+        </w:tc>
+      </w:tr>
+      <w:tr>
+        <w:tc>
+          <w:tcPr>
+            <w:tcW w:type="dxa" w:w="3312"/>
+          </w:tcPr>
+          <w:p>
+            <w:r>
+              <w:rPr>
+                <w:rFonts w:ascii="宋体" w:hAnsi="宋体" w:eastAsia="宋体"/>
+                <w:b w:val="0"/>
+                <w:sz w:val="19"/>
+              </w:rPr>
+              <w:t>工具失败</w:t>
+            </w:r>
+          </w:p>
+        </w:tc>
+        <w:tc>
+          <w:tcPr>
+            <w:tcW w:type="dxa" w:w="3312"/>
+          </w:tcPr>
+          <w:p>
+            <w:r>
+              <w:rPr>
+                <w:rFonts w:ascii="宋体" w:hAnsi="宋体" w:eastAsia="宋体"/>
+                <w:b w:val="0"/>
+                <w:sz w:val="19"/>
+              </w:rPr>
+              <w:t>表单草稿失败、OCR 超时、RAG 服务异常</w:t>
+            </w:r>
+          </w:p>
+        </w:tc>
+        <w:tc>
+          <w:tcPr>
+            <w:tcW w:type="dxa" w:w="3312"/>
+          </w:tcPr>
+          <w:p>
+            <w:r>
+              <w:rPr>
+                <w:rFonts w:ascii="宋体" w:hAnsi="宋体" w:eastAsia="宋体"/>
+                <w:b w:val="0"/>
+                <w:sz w:val="19"/>
+              </w:rPr>
+              <w:t>允许重试一次；仍失败则进入人工办理路径。</w:t>
+            </w:r>
+          </w:p>
+        </w:tc>
+      </w:tr>
+      <w:tr>
+        <w:tc>
+          <w:tcPr>
+            <w:tcW w:type="dxa" w:w="3312"/>
+          </w:tcPr>
+          <w:p>
+            <w:r>
+              <w:rPr>
+                <w:rFonts w:ascii="宋体" w:hAnsi="宋体" w:eastAsia="宋体"/>
+                <w:b w:val="0"/>
+                <w:sz w:val="19"/>
+              </w:rPr>
+              <w:t>权限不足</w:t>
+            </w:r>
+          </w:p>
+        </w:tc>
+        <w:tc>
+          <w:tcPr>
+            <w:tcW w:type="dxa" w:w="3312"/>
+          </w:tcPr>
+          <w:p>
+            <w:r>
+              <w:rPr>
+                <w:rFonts w:ascii="宋体" w:hAnsi="宋体" w:eastAsia="宋体"/>
+                <w:b w:val="0"/>
+                <w:sz w:val="19"/>
+              </w:rPr>
+              <w:t>用户无项目、表单、导出或改绑权限</w:t>
+            </w:r>
+          </w:p>
+        </w:tc>
+        <w:tc>
+          <w:tcPr>
+            <w:tcW w:type="dxa" w:w="3312"/>
+          </w:tcPr>
+          <w:p>
+            <w:r>
+              <w:rPr>
+                <w:rFonts w:ascii="宋体" w:hAnsi="宋体" w:eastAsia="宋体"/>
+                <w:b w:val="0"/>
+                <w:sz w:val="19"/>
+              </w:rPr>
+              <w:t>禁止继续办理，不泄露不可见对象存在性，给出权限申请路径。</w:t>
+            </w:r>
+          </w:p>
+        </w:tc>
+      </w:tr>
+    </w:tbl>
+    <w:p/>
+    <w:p>
+      <w:pPr>
+        <w:pStyle w:val="Heading4"/>
+        <w:jc w:val="left"/>
+      </w:pPr>
+      <w:r>
+        <w:rPr>
+          <w:rFonts w:ascii="宋体" w:hAnsi="宋体" w:eastAsia="宋体"/>
+          <w:b/>
+          <w:sz w:val="24"/>
+        </w:rPr>
+        <w:t>6.6.2 人工动作</w:t>
+      </w:r>
+    </w:p>
+    <w:tbl>
+      <w:tblPr>
+        <w:tblStyle w:val="TableGrid"/>
+        <w:tblW w:type="auto" w:w="0"/>
+        <w:tblLook w:firstColumn="1" w:firstRow="1" w:lastColumn="0" w:lastRow="0" w:noHBand="0" w:noVBand="1" w:val="04A0"/>
+      </w:tblPr>
+      <w:tblGrid>
+        <w:gridCol w:w="3312"/>
+        <w:gridCol w:w="3312"/>
+        <w:gridCol w:w="3312"/>
+      </w:tblGrid>
+      <w:tr>
+        <w:tc>
+          <w:tcPr>
+            <w:tcW w:type="dxa" w:w="3312"/>
+          </w:tcPr>
+          <w:p>
+            <w:r>
+              <w:rPr>
+                <w:rFonts w:ascii="宋体" w:hAnsi="宋体" w:eastAsia="宋体"/>
+                <w:b/>
+                <w:sz w:val="19"/>
+              </w:rPr>
+              <w:t>人工动作</w:t>
+            </w:r>
+          </w:p>
+        </w:tc>
+        <w:tc>
+          <w:tcPr>
+            <w:tcW w:type="dxa" w:w="3312"/>
+          </w:tcPr>
+          <w:p>
+            <w:r>
+              <w:rPr>
+                <w:rFonts w:ascii="宋体" w:hAnsi="宋体" w:eastAsia="宋体"/>
+                <w:b/>
+                <w:sz w:val="19"/>
+              </w:rPr>
+              <w:t>适用场景</w:t>
+            </w:r>
+          </w:p>
+        </w:tc>
+        <w:tc>
+          <w:tcPr>
+            <w:tcW w:type="dxa" w:w="3312"/>
+          </w:tcPr>
+          <w:p>
+            <w:r>
+              <w:rPr>
+                <w:rFonts w:ascii="宋体" w:hAnsi="宋体" w:eastAsia="宋体"/>
+                <w:b/>
+                <w:sz w:val="19"/>
+              </w:rPr>
+              <w:t>结果</w:t>
+            </w:r>
+          </w:p>
+        </w:tc>
+      </w:tr>
+      <w:tr>
+        <w:tc>
+          <w:tcPr>
+            <w:tcW w:type="dxa" w:w="3312"/>
+          </w:tcPr>
+          <w:p>
+            <w:r>
+              <w:rPr>
+                <w:rFonts w:ascii="宋体" w:hAnsi="宋体" w:eastAsia="宋体"/>
+                <w:b w:val="0"/>
+                <w:sz w:val="19"/>
+              </w:rPr>
+              <w:t>选择候选</w:t>
+            </w:r>
+          </w:p>
+        </w:tc>
+        <w:tc>
+          <w:tcPr>
+            <w:tcW w:type="dxa" w:w="3312"/>
+          </w:tcPr>
+          <w:p>
+            <w:r>
+              <w:rPr>
+                <w:rFonts w:ascii="宋体" w:hAnsi="宋体" w:eastAsia="宋体"/>
+                <w:b w:val="0"/>
+                <w:sz w:val="19"/>
+              </w:rPr>
+              <w:t>多项目、多结构、多人员、多指南、多表单</w:t>
+            </w:r>
+          </w:p>
+        </w:tc>
+        <w:tc>
+          <w:tcPr>
+            <w:tcW w:type="dxa" w:w="3312"/>
+          </w:tcPr>
+          <w:p>
+            <w:r>
+              <w:rPr>
+                <w:rFonts w:ascii="宋体" w:hAnsi="宋体" w:eastAsia="宋体"/>
+                <w:b w:val="0"/>
+                <w:sz w:val="19"/>
+              </w:rPr>
+              <w:t>以用户选择作为后续业务参数。</w:t>
+            </w:r>
+          </w:p>
+        </w:tc>
+      </w:tr>
+      <w:tr>
+        <w:tc>
+          <w:tcPr>
+            <w:tcW w:type="dxa" w:w="3312"/>
+          </w:tcPr>
+          <w:p>
+            <w:r>
+              <w:rPr>
+                <w:rFonts w:ascii="宋体" w:hAnsi="宋体" w:eastAsia="宋体"/>
+                <w:b w:val="0"/>
+                <w:sz w:val="19"/>
+              </w:rPr>
+              <w:t>修改字段</w:t>
+            </w:r>
+          </w:p>
+        </w:tc>
+        <w:tc>
+          <w:tcPr>
+            <w:tcW w:type="dxa" w:w="3312"/>
+          </w:tcPr>
+          <w:p>
+            <w:r>
+              <w:rPr>
+                <w:rFonts w:ascii="宋体" w:hAnsi="宋体" w:eastAsia="宋体"/>
+                <w:b w:val="0"/>
+                <w:sz w:val="19"/>
+              </w:rPr>
+              <w:t>AI 字段识别错误或业务选择调整</w:t>
+            </w:r>
+          </w:p>
+        </w:tc>
+        <w:tc>
+          <w:tcPr>
+            <w:tcW w:type="dxa" w:w="3312"/>
+          </w:tcPr>
+          <w:p>
+            <w:r>
+              <w:rPr>
+                <w:rFonts w:ascii="宋体" w:hAnsi="宋体" w:eastAsia="宋体"/>
+                <w:b w:val="0"/>
+                <w:sz w:val="19"/>
+              </w:rPr>
+              <w:t>保存 AI 原值、用户修改值、来源和原因。</w:t>
+            </w:r>
+          </w:p>
+        </w:tc>
+      </w:tr>
+      <w:tr>
+        <w:tc>
+          <w:tcPr>
+            <w:tcW w:type="dxa" w:w="3312"/>
+          </w:tcPr>
+          <w:p>
+            <w:r>
+              <w:rPr>
+                <w:rFonts w:ascii="宋体" w:hAnsi="宋体" w:eastAsia="宋体"/>
+                <w:b w:val="0"/>
+                <w:sz w:val="19"/>
+              </w:rPr>
+              <w:t>补录字段</w:t>
+            </w:r>
+          </w:p>
+        </w:tc>
+        <w:tc>
+          <w:tcPr>
+            <w:tcW w:type="dxa" w:w="3312"/>
+          </w:tcPr>
+          <w:p>
+            <w:r>
+              <w:rPr>
+                <w:rFonts w:ascii="宋体" w:hAnsi="宋体" w:eastAsia="宋体"/>
+                <w:b w:val="0"/>
+                <w:sz w:val="19"/>
+              </w:rPr>
+              <w:t>必填字段缺失、OCR 未识别、语音转写缺失</w:t>
+            </w:r>
+          </w:p>
+        </w:tc>
+        <w:tc>
+          <w:tcPr>
+            <w:tcW w:type="dxa" w:w="3312"/>
+          </w:tcPr>
+          <w:p>
+            <w:r>
+              <w:rPr>
+                <w:rFonts w:ascii="宋体" w:hAnsi="宋体" w:eastAsia="宋体"/>
+                <w:b w:val="0"/>
+                <w:sz w:val="19"/>
+              </w:rPr>
+              <w:t>补齐后继续生成草稿或进入确认页。</w:t>
+            </w:r>
+          </w:p>
+        </w:tc>
+      </w:tr>
+      <w:tr>
+        <w:tc>
+          <w:tcPr>
+            <w:tcW w:type="dxa" w:w="3312"/>
+          </w:tcPr>
+          <w:p>
+            <w:r>
+              <w:rPr>
+                <w:rFonts w:ascii="宋体" w:hAnsi="宋体" w:eastAsia="宋体"/>
+                <w:b w:val="0"/>
+                <w:sz w:val="19"/>
+              </w:rPr>
+              <w:t>人工绑定</w:t>
+            </w:r>
+          </w:p>
+        </w:tc>
+        <w:tc>
+          <w:tcPr>
+            <w:tcW w:type="dxa" w:w="3312"/>
+          </w:tcPr>
+          <w:p>
+            <w:r>
+              <w:rPr>
+                <w:rFonts w:ascii="宋体" w:hAnsi="宋体" w:eastAsia="宋体"/>
+                <w:b w:val="0"/>
+                <w:sz w:val="19"/>
+              </w:rPr>
+              <w:t>OCR 未匹配结构、人员或附件对象</w:t>
+            </w:r>
+          </w:p>
+        </w:tc>
+        <w:tc>
+          <w:tcPr>
+            <w:tcW w:type="dxa" w:w="3312"/>
+          </w:tcPr>
+          <w:p>
+            <w:r>
+              <w:rPr>
+                <w:rFonts w:ascii="宋体" w:hAnsi="宋体" w:eastAsia="宋体"/>
+                <w:b w:val="0"/>
+                <w:sz w:val="19"/>
+              </w:rPr>
+              <w:t>绑定已有对象；不得自动新增基础库。</w:t>
+            </w:r>
+          </w:p>
+        </w:tc>
+      </w:tr>
+      <w:tr>
+        <w:tc>
+          <w:tcPr>
+            <w:tcW w:type="dxa" w:w="3312"/>
+          </w:tcPr>
+          <w:p>
+            <w:r>
+              <w:rPr>
+                <w:rFonts w:ascii="宋体" w:hAnsi="宋体" w:eastAsia="宋体"/>
+                <w:b w:val="0"/>
+                <w:sz w:val="19"/>
+              </w:rPr>
+              <w:t>转表单手工办理</w:t>
+            </w:r>
+          </w:p>
+        </w:tc>
+        <w:tc>
+          <w:tcPr>
+            <w:tcW w:type="dxa" w:w="3312"/>
+          </w:tcPr>
+          <w:p>
+            <w:r>
+              <w:rPr>
+                <w:rFonts w:ascii="宋体" w:hAnsi="宋体" w:eastAsia="宋体"/>
+                <w:b w:val="0"/>
+                <w:sz w:val="19"/>
+              </w:rPr>
+              <w:t>追问仍无法补齐、Agent 服务失败</w:t>
+            </w:r>
+          </w:p>
+        </w:tc>
+        <w:tc>
+          <w:tcPr>
+            <w:tcW w:type="dxa" w:w="3312"/>
+          </w:tcPr>
+          <w:p>
+            <w:r>
+              <w:rPr>
+                <w:rFonts w:ascii="宋体" w:hAnsi="宋体" w:eastAsia="宋体"/>
+                <w:b w:val="0"/>
+                <w:sz w:val="19"/>
+              </w:rPr>
+              <w:t>打开空白或半预填既有业务表单。</w:t>
+            </w:r>
+          </w:p>
+        </w:tc>
+      </w:tr>
+      <w:tr>
+        <w:tc>
+          <w:tcPr>
+            <w:tcW w:type="dxa" w:w="3312"/>
+          </w:tcPr>
+          <w:p>
+            <w:r>
+              <w:rPr>
+                <w:rFonts w:ascii="宋体" w:hAnsi="宋体" w:eastAsia="宋体"/>
+                <w:b w:val="0"/>
+                <w:sz w:val="19"/>
+              </w:rPr>
+              <w:t>作废/取消任务</w:t>
+            </w:r>
+          </w:p>
+        </w:tc>
+        <w:tc>
+          <w:tcPr>
+            <w:tcW w:type="dxa" w:w="3312"/>
+          </w:tcPr>
+          <w:p>
+            <w:r>
+              <w:rPr>
+                <w:rFonts w:ascii="宋体" w:hAnsi="宋体" w:eastAsia="宋体"/>
+                <w:b w:val="0"/>
+                <w:sz w:val="19"/>
+              </w:rPr>
+              <w:t>上传错误、任务重复、业务不再办理</w:t>
+            </w:r>
+          </w:p>
+        </w:tc>
+        <w:tc>
+          <w:tcPr>
+            <w:tcW w:type="dxa" w:w="3312"/>
+          </w:tcPr>
+          <w:p>
+            <w:r>
+              <w:rPr>
+                <w:rFonts w:ascii="宋体" w:hAnsi="宋体" w:eastAsia="宋体"/>
+                <w:b w:val="0"/>
+                <w:sz w:val="19"/>
+              </w:rPr>
+              <w:t>保留任务记录和原因，不写入正式业务。</w:t>
+            </w:r>
+          </w:p>
+        </w:tc>
+      </w:tr>
+      <w:tr>
+        <w:tc>
+          <w:tcPr>
+            <w:tcW w:type="dxa" w:w="3312"/>
+          </w:tcPr>
+          <w:p>
+            <w:r>
+              <w:rPr>
+                <w:rFonts w:ascii="宋体" w:hAnsi="宋体" w:eastAsia="宋体"/>
+                <w:b w:val="0"/>
+                <w:sz w:val="19"/>
+              </w:rPr>
+              <w:t>转管理员处理</w:t>
+            </w:r>
+          </w:p>
+        </w:tc>
+        <w:tc>
+          <w:tcPr>
+            <w:tcW w:type="dxa" w:w="3312"/>
+          </w:tcPr>
+          <w:p>
+            <w:r>
+              <w:rPr>
+                <w:rFonts w:ascii="宋体" w:hAnsi="宋体" w:eastAsia="宋体"/>
+                <w:b w:val="0"/>
+                <w:sz w:val="19"/>
+              </w:rPr>
+              <w:t>需要改绑、作废已确认批次或配置修正</w:t>
+            </w:r>
+          </w:p>
+        </w:tc>
+        <w:tc>
+          <w:tcPr>
+            <w:tcW w:type="dxa" w:w="3312"/>
+          </w:tcPr>
+          <w:p>
+            <w:r>
+              <w:rPr>
+                <w:rFonts w:ascii="宋体" w:hAnsi="宋体" w:eastAsia="宋体"/>
+                <w:b w:val="0"/>
+                <w:sz w:val="19"/>
+              </w:rPr>
+              <w:t>创建待处理事项，由授权角色处理。</w:t>
+            </w:r>
+          </w:p>
+        </w:tc>
+      </w:tr>
+    </w:tbl>
+    <w:p/>
+    <w:p>
+      <w:pPr>
+        <w:pStyle w:val="Heading4"/>
+        <w:jc w:val="left"/>
+      </w:pPr>
+      <w:r>
+        <w:rPr>
+          <w:rFonts w:ascii="宋体" w:hAnsi="宋体" w:eastAsia="宋体"/>
+          <w:b/>
+          <w:sz w:val="24"/>
+        </w:rPr>
+        <w:t>6.6.3 人工兜底状态</w:t>
+      </w:r>
+    </w:p>
+    <w:tbl>
+      <w:tblPr>
+        <w:tblStyle w:val="TableGrid"/>
+        <w:tblW w:type="auto" w:w="0"/>
+        <w:tblLook w:firstColumn="1" w:firstRow="1" w:lastColumn="0" w:lastRow="0" w:noHBand="0" w:noVBand="1" w:val="04A0"/>
+      </w:tblPr>
+      <w:tblGrid>
+        <w:gridCol w:w="2484"/>
+        <w:gridCol w:w="2484"/>
+        <w:gridCol w:w="2484"/>
+        <w:gridCol w:w="2484"/>
+      </w:tblGrid>
+      <w:tr>
+        <w:tc>
+          <w:tcPr>
+            <w:tcW w:type="dxa" w:w="2484"/>
+          </w:tcPr>
+          <w:p>
+            <w:r>
+              <w:rPr>
+                <w:rFonts w:ascii="宋体" w:hAnsi="宋体" w:eastAsia="宋体"/>
+                <w:b/>
+                <w:sz w:val="19"/>
+              </w:rPr>
+              <w:t>状态</w:t>
+            </w:r>
+          </w:p>
+        </w:tc>
+        <w:tc>
+          <w:tcPr>
+            <w:tcW w:type="dxa" w:w="2484"/>
+          </w:tcPr>
+          <w:p>
+            <w:r>
+              <w:rPr>
+                <w:rFonts w:ascii="宋体" w:hAnsi="宋体" w:eastAsia="宋体"/>
+                <w:b/>
+                <w:sz w:val="19"/>
+              </w:rPr>
+              <w:t>含义</w:t>
+            </w:r>
+          </w:p>
+        </w:tc>
+        <w:tc>
+          <w:tcPr>
+            <w:tcW w:type="dxa" w:w="2484"/>
+          </w:tcPr>
+          <w:p>
+            <w:r>
+              <w:rPr>
+                <w:rFonts w:ascii="宋体" w:hAnsi="宋体" w:eastAsia="宋体"/>
+                <w:b/>
+                <w:sz w:val="19"/>
+              </w:rPr>
+              <w:t>进入条件</w:t>
+            </w:r>
+          </w:p>
+        </w:tc>
+        <w:tc>
+          <w:tcPr>
+            <w:tcW w:type="dxa" w:w="2484"/>
+          </w:tcPr>
+          <w:p>
+            <w:r>
+              <w:rPr>
+                <w:rFonts w:ascii="宋体" w:hAnsi="宋体" w:eastAsia="宋体"/>
+                <w:b/>
+                <w:sz w:val="19"/>
+              </w:rPr>
+              <w:t>退出条件</w:t>
+            </w:r>
+          </w:p>
+        </w:tc>
+      </w:tr>
+      <w:tr>
+        <w:tc>
+          <w:tcPr>
+            <w:tcW w:type="dxa" w:w="2484"/>
+          </w:tcPr>
+          <w:p>
+            <w:r>
+              <w:rPr>
+                <w:rFonts w:ascii="宋体" w:hAnsi="宋体" w:eastAsia="宋体"/>
+                <w:b w:val="0"/>
+                <w:sz w:val="19"/>
+              </w:rPr>
+              <w:t>待人工确认</w:t>
+            </w:r>
+          </w:p>
+        </w:tc>
+        <w:tc>
+          <w:tcPr>
+            <w:tcW w:type="dxa" w:w="2484"/>
+          </w:tcPr>
+          <w:p>
+            <w:r>
+              <w:rPr>
+                <w:rFonts w:ascii="宋体" w:hAnsi="宋体" w:eastAsia="宋体"/>
+                <w:b w:val="0"/>
+                <w:sz w:val="19"/>
+              </w:rPr>
+              <w:t>AI 给出草稿、候选或 OCR 结果但不能自动生效</w:t>
+            </w:r>
+          </w:p>
+        </w:tc>
+        <w:tc>
+          <w:tcPr>
+            <w:tcW w:type="dxa" w:w="2484"/>
+          </w:tcPr>
+          <w:p>
+            <w:r>
+              <w:rPr>
+                <w:rFonts w:ascii="宋体" w:hAnsi="宋体" w:eastAsia="宋体"/>
+                <w:b w:val="0"/>
+                <w:sz w:val="19"/>
+              </w:rPr>
+              <w:t>需要用户选择、修改或确认</w:t>
+            </w:r>
+          </w:p>
+        </w:tc>
+        <w:tc>
+          <w:tcPr>
+            <w:tcW w:type="dxa" w:w="2484"/>
+          </w:tcPr>
+          <w:p>
+            <w:r>
+              <w:rPr>
+                <w:rFonts w:ascii="宋体" w:hAnsi="宋体" w:eastAsia="宋体"/>
+                <w:b w:val="0"/>
+                <w:sz w:val="19"/>
+              </w:rPr>
+              <w:t>用户确认、取消或转人工办理</w:t>
+            </w:r>
+          </w:p>
+        </w:tc>
+      </w:tr>
+      <w:tr>
+        <w:tc>
+          <w:tcPr>
+            <w:tcW w:type="dxa" w:w="2484"/>
+          </w:tcPr>
+          <w:p>
+            <w:r>
+              <w:rPr>
+                <w:rFonts w:ascii="宋体" w:hAnsi="宋体" w:eastAsia="宋体"/>
+                <w:b w:val="0"/>
+                <w:sz w:val="19"/>
+              </w:rPr>
+              <w:t>待人工补录</w:t>
+            </w:r>
+          </w:p>
+        </w:tc>
+        <w:tc>
+          <w:tcPr>
+            <w:tcW w:type="dxa" w:w="2484"/>
+          </w:tcPr>
+          <w:p>
+            <w:r>
+              <w:rPr>
+                <w:rFonts w:ascii="宋体" w:hAnsi="宋体" w:eastAsia="宋体"/>
+                <w:b w:val="0"/>
+                <w:sz w:val="19"/>
+              </w:rPr>
+              <w:t>关键字段缺失或无法标准化</w:t>
+            </w:r>
+          </w:p>
+        </w:tc>
+        <w:tc>
+          <w:tcPr>
+            <w:tcW w:type="dxa" w:w="2484"/>
+          </w:tcPr>
+          <w:p>
+            <w:r>
+              <w:rPr>
+                <w:rFonts w:ascii="宋体" w:hAnsi="宋体" w:eastAsia="宋体"/>
+                <w:b w:val="0"/>
+                <w:sz w:val="19"/>
+              </w:rPr>
+              <w:t>缺项目、部位、类型、人员、时间等</w:t>
+            </w:r>
+          </w:p>
+        </w:tc>
+        <w:tc>
+          <w:tcPr>
+            <w:tcW w:type="dxa" w:w="2484"/>
+          </w:tcPr>
+          <w:p>
+            <w:r>
+              <w:rPr>
+                <w:rFonts w:ascii="宋体" w:hAnsi="宋体" w:eastAsia="宋体"/>
+                <w:b w:val="0"/>
+                <w:sz w:val="19"/>
+              </w:rPr>
+              <w:t>补录完成或进入手工表单</w:t>
+            </w:r>
+          </w:p>
+        </w:tc>
+      </w:tr>
+      <w:tr>
+        <w:tc>
+          <w:tcPr>
+            <w:tcW w:type="dxa" w:w="2484"/>
+          </w:tcPr>
+          <w:p>
+            <w:r>
+              <w:rPr>
+                <w:rFonts w:ascii="宋体" w:hAnsi="宋体" w:eastAsia="宋体"/>
+                <w:b w:val="0"/>
+                <w:sz w:val="19"/>
+              </w:rPr>
+              <w:t>待人工绑定</w:t>
+            </w:r>
+          </w:p>
+        </w:tc>
+        <w:tc>
+          <w:tcPr>
+            <w:tcW w:type="dxa" w:w="2484"/>
+          </w:tcPr>
+          <w:p>
+            <w:r>
+              <w:rPr>
+                <w:rFonts w:ascii="宋体" w:hAnsi="宋体" w:eastAsia="宋体"/>
+                <w:b w:val="0"/>
+                <w:sz w:val="19"/>
+              </w:rPr>
+              <w:t>系统库无明确匹配或多候选冲突</w:t>
+            </w:r>
+          </w:p>
+        </w:tc>
+        <w:tc>
+          <w:tcPr>
+            <w:tcW w:type="dxa" w:w="2484"/>
+          </w:tcPr>
+          <w:p>
+            <w:r>
+              <w:rPr>
+                <w:rFonts w:ascii="宋体" w:hAnsi="宋体" w:eastAsia="宋体"/>
+                <w:b w:val="0"/>
+                <w:sz w:val="19"/>
+              </w:rPr>
+              <w:t>结构、人员、附件、表单候选不唯一</w:t>
+            </w:r>
+          </w:p>
+        </w:tc>
+        <w:tc>
+          <w:tcPr>
+            <w:tcW w:type="dxa" w:w="2484"/>
+          </w:tcPr>
+          <w:p>
+            <w:r>
+              <w:rPr>
+                <w:rFonts w:ascii="宋体" w:hAnsi="宋体" w:eastAsia="宋体"/>
+                <w:b w:val="0"/>
+                <w:sz w:val="19"/>
+              </w:rPr>
+              <w:t>用户绑定已有对象或标记未匹配</w:t>
+            </w:r>
+          </w:p>
+        </w:tc>
+      </w:tr>
+      <w:tr>
+        <w:tc>
+          <w:tcPr>
+            <w:tcW w:type="dxa" w:w="2484"/>
+          </w:tcPr>
+          <w:p>
+            <w:r>
+              <w:rPr>
+                <w:rFonts w:ascii="宋体" w:hAnsi="宋体" w:eastAsia="宋体"/>
+                <w:b w:val="0"/>
+                <w:sz w:val="19"/>
+              </w:rPr>
+              <w:t>人工处理中</w:t>
+            </w:r>
+          </w:p>
+        </w:tc>
+        <w:tc>
+          <w:tcPr>
+            <w:tcW w:type="dxa" w:w="2484"/>
+          </w:tcPr>
+          <w:p>
+            <w:r>
+              <w:rPr>
+                <w:rFonts w:ascii="宋体" w:hAnsi="宋体" w:eastAsia="宋体"/>
+                <w:b w:val="0"/>
+                <w:sz w:val="19"/>
+              </w:rPr>
+              <w:t>已转入既有业务人工流程</w:t>
+            </w:r>
+          </w:p>
+        </w:tc>
+        <w:tc>
+          <w:tcPr>
+            <w:tcW w:type="dxa" w:w="2484"/>
+          </w:tcPr>
+          <w:p>
+            <w:r>
+              <w:rPr>
+                <w:rFonts w:ascii="宋体" w:hAnsi="宋体" w:eastAsia="宋体"/>
+                <w:b w:val="0"/>
+                <w:sz w:val="19"/>
+              </w:rPr>
+              <w:t>AI 服务失败、追问上限、用户选择人工办理</w:t>
+            </w:r>
+          </w:p>
+        </w:tc>
+        <w:tc>
+          <w:tcPr>
+            <w:tcW w:type="dxa" w:w="2484"/>
+          </w:tcPr>
+          <w:p>
+            <w:r>
+              <w:rPr>
+                <w:rFonts w:ascii="宋体" w:hAnsi="宋体" w:eastAsia="宋体"/>
+                <w:b w:val="0"/>
+                <w:sz w:val="19"/>
+              </w:rPr>
+              <w:t>人工提交、人工取消或作废</w:t>
+            </w:r>
+          </w:p>
+        </w:tc>
+      </w:tr>
+      <w:tr>
+        <w:tc>
+          <w:tcPr>
+            <w:tcW w:type="dxa" w:w="2484"/>
+          </w:tcPr>
+          <w:p>
+            <w:r>
+              <w:rPr>
+                <w:rFonts w:ascii="宋体" w:hAnsi="宋体" w:eastAsia="宋体"/>
+                <w:b w:val="0"/>
+                <w:sz w:val="19"/>
+              </w:rPr>
+              <w:t>人工处理完成</w:t>
+            </w:r>
+          </w:p>
+        </w:tc>
+        <w:tc>
+          <w:tcPr>
+            <w:tcW w:type="dxa" w:w="2484"/>
+          </w:tcPr>
+          <w:p>
+            <w:r>
+              <w:rPr>
+                <w:rFonts w:ascii="宋体" w:hAnsi="宋体" w:eastAsia="宋体"/>
+                <w:b w:val="0"/>
+                <w:sz w:val="19"/>
+              </w:rPr>
+              <w:t>业务通过人工路径完成</w:t>
+            </w:r>
+          </w:p>
+        </w:tc>
+        <w:tc>
+          <w:tcPr>
+            <w:tcW w:type="dxa" w:w="2484"/>
+          </w:tcPr>
+          <w:p>
+            <w:r>
+              <w:rPr>
+                <w:rFonts w:ascii="宋体" w:hAnsi="宋体" w:eastAsia="宋体"/>
+                <w:b w:val="0"/>
+                <w:sz w:val="19"/>
+              </w:rPr>
+              <w:t>表单提交、附件挂接或任务关闭</w:t>
+            </w:r>
+          </w:p>
+        </w:tc>
+        <w:tc>
+          <w:tcPr>
+            <w:tcW w:type="dxa" w:w="2484"/>
+          </w:tcPr>
+          <w:p>
+            <w:r>
+              <w:rPr>
+                <w:rFonts w:ascii="宋体" w:hAnsi="宋体" w:eastAsia="宋体"/>
+                <w:b w:val="0"/>
+                <w:sz w:val="19"/>
+              </w:rPr>
+              <w:t>进入历史和审计</w:t>
+            </w:r>
+          </w:p>
+        </w:tc>
+      </w:tr>
+      <w:tr>
+        <w:tc>
+          <w:tcPr>
+            <w:tcW w:type="dxa" w:w="2484"/>
+          </w:tcPr>
+          <w:p>
+            <w:r>
+              <w:rPr>
+                <w:rFonts w:ascii="宋体" w:hAnsi="宋体" w:eastAsia="宋体"/>
+                <w:b w:val="0"/>
+                <w:sz w:val="19"/>
+              </w:rPr>
+              <w:t>人工作废</w:t>
+            </w:r>
+          </w:p>
+        </w:tc>
+        <w:tc>
+          <w:tcPr>
+            <w:tcW w:type="dxa" w:w="2484"/>
+          </w:tcPr>
+          <w:p>
+            <w:r>
+              <w:rPr>
+                <w:rFonts w:ascii="宋体" w:hAnsi="宋体" w:eastAsia="宋体"/>
+                <w:b w:val="0"/>
+                <w:sz w:val="19"/>
+              </w:rPr>
+              <w:t>用户或管理员终止任务</w:t>
+            </w:r>
+          </w:p>
+        </w:tc>
+        <w:tc>
+          <w:tcPr>
+            <w:tcW w:type="dxa" w:w="2484"/>
+          </w:tcPr>
+          <w:p>
+            <w:r>
+              <w:rPr>
+                <w:rFonts w:ascii="宋体" w:hAnsi="宋体" w:eastAsia="宋体"/>
+                <w:b w:val="0"/>
+                <w:sz w:val="19"/>
+              </w:rPr>
+              <w:t>上传错误、重复任务、不再办理</w:t>
+            </w:r>
+          </w:p>
+        </w:tc>
+        <w:tc>
+          <w:tcPr>
+            <w:tcW w:type="dxa" w:w="2484"/>
+          </w:tcPr>
+          <w:p>
+            <w:r>
+              <w:rPr>
+                <w:rFonts w:ascii="宋体" w:hAnsi="宋体" w:eastAsia="宋体"/>
+                <w:b w:val="0"/>
+                <w:sz w:val="19"/>
+              </w:rPr>
+              <w:t>进入历史和审计</w:t>
+            </w:r>
+          </w:p>
+        </w:tc>
+      </w:tr>
+    </w:tbl>
+    <w:p/>
+    <w:p>
+      <w:pPr>
+        <w:pStyle w:val="Heading4"/>
+        <w:jc w:val="left"/>
+      </w:pPr>
+      <w:r>
+        <w:rPr>
+          <w:rFonts w:ascii="宋体" w:hAnsi="宋体" w:eastAsia="宋体"/>
+          <w:b/>
+          <w:sz w:val="24"/>
+        </w:rPr>
+        <w:t>6.6.4 审计与指标</w:t>
+      </w:r>
+    </w:p>
+    <w:p>
+      <w:pPr>
+        <w:spacing w:before="0" w:after="80" w:line="360" w:lineRule="auto"/>
+      </w:pPr>
+      <w:r>
+        <w:rPr>
+          <w:rFonts w:ascii="宋体" w:hAnsi="宋体" w:eastAsia="宋体"/>
+          <w:b w:val="0"/>
+          <w:sz w:val="21"/>
+        </w:rPr>
+        <w:t>系统必须记录每次人工介入的触发原因、AI 原始输出、用户操作、最终业务结果和处理人。运营看板至少统计：低置信度触发次数、人工修改率、人工补录率、人工绑定量、人工处理完成率、人工作废量、重复任务量、工具失败转人工量。</w:t>
+      </w:r>
+    </w:p>
+    <w:p>
+      <w:pPr>
         <w:pStyle w:val="Heading2"/>
         <w:jc w:val="left"/>
       </w:pPr>
@@ -7678,6 +9312,409 @@
                 <w:sz w:val="19"/>
               </w:rPr>
               <w:t>每类失败返回可理解提示和人工处理路径。</w:t>
+            </w:r>
+          </w:p>
+        </w:tc>
+      </w:tr>
+    </w:tbl>
+    <w:p/>
+    <w:p>
+      <w:pPr>
+        <w:pStyle w:val="Heading3"/>
+        <w:jc w:val="left"/>
+      </w:pPr>
+      <w:r>
+        <w:rPr>
+          <w:rFonts w:ascii="宋体" w:hAnsi="宋体" w:eastAsia="宋体"/>
+          <w:b/>
+          <w:sz w:val="24"/>
+        </w:rPr>
+        <w:t>7.10 人在回路与人工兜底</w:t>
+      </w:r>
+    </w:p>
+    <w:tbl>
+      <w:tblPr>
+        <w:tblStyle w:val="TableGrid"/>
+        <w:tblW w:type="auto" w:w="0"/>
+        <w:tblLook w:firstColumn="1" w:firstRow="1" w:lastColumn="0" w:lastRow="0" w:noHBand="0" w:noVBand="1" w:val="04A0"/>
+      </w:tblPr>
+      <w:tblGrid>
+        <w:gridCol w:w="3312"/>
+        <w:gridCol w:w="3312"/>
+        <w:gridCol w:w="3312"/>
+      </w:tblGrid>
+      <w:tr>
+        <w:tc>
+          <w:tcPr>
+            <w:tcW w:type="dxa" w:w="3312"/>
+          </w:tcPr>
+          <w:p>
+            <w:r>
+              <w:rPr>
+                <w:rFonts w:ascii="宋体" w:hAnsi="宋体" w:eastAsia="宋体"/>
+                <w:b/>
+                <w:sz w:val="19"/>
+              </w:rPr>
+              <w:t>编号</w:t>
+            </w:r>
+          </w:p>
+        </w:tc>
+        <w:tc>
+          <w:tcPr>
+            <w:tcW w:type="dxa" w:w="3312"/>
+          </w:tcPr>
+          <w:p>
+            <w:r>
+              <w:rPr>
+                <w:rFonts w:ascii="宋体" w:hAnsi="宋体" w:eastAsia="宋体"/>
+                <w:b/>
+                <w:sz w:val="19"/>
+              </w:rPr>
+              <w:t>功能需求</w:t>
+            </w:r>
+          </w:p>
+        </w:tc>
+        <w:tc>
+          <w:tcPr>
+            <w:tcW w:type="dxa" w:w="3312"/>
+          </w:tcPr>
+          <w:p>
+            <w:r>
+              <w:rPr>
+                <w:rFonts w:ascii="宋体" w:hAnsi="宋体" w:eastAsia="宋体"/>
+                <w:b/>
+                <w:sz w:val="19"/>
+              </w:rPr>
+              <w:t>验收要点</w:t>
+            </w:r>
+          </w:p>
+        </w:tc>
+      </w:tr>
+      <w:tr>
+        <w:tc>
+          <w:tcPr>
+            <w:tcW w:type="dxa" w:w="3312"/>
+          </w:tcPr>
+          <w:p>
+            <w:r>
+              <w:rPr>
+                <w:rFonts w:ascii="宋体" w:hAnsi="宋体" w:eastAsia="宋体"/>
+                <w:b w:val="0"/>
+                <w:sz w:val="19"/>
+              </w:rPr>
+              <w:t>FR-049</w:t>
+            </w:r>
+          </w:p>
+        </w:tc>
+        <w:tc>
+          <w:tcPr>
+            <w:tcW w:type="dxa" w:w="3312"/>
+          </w:tcPr>
+          <w:p>
+            <w:r>
+              <w:rPr>
+                <w:rFonts w:ascii="宋体" w:hAnsi="宋体" w:eastAsia="宋体"/>
+                <w:b w:val="0"/>
+                <w:sz w:val="19"/>
+              </w:rPr>
+              <w:t>AI 低置信度、无结果、多候选冲突或识别错误时必须进入人在回路。</w:t>
+            </w:r>
+          </w:p>
+        </w:tc>
+        <w:tc>
+          <w:tcPr>
+            <w:tcW w:type="dxa" w:w="3312"/>
+          </w:tcPr>
+          <w:p>
+            <w:r>
+              <w:rPr>
+                <w:rFonts w:ascii="宋体" w:hAnsi="宋体" w:eastAsia="宋体"/>
+                <w:b w:val="0"/>
+                <w:sz w:val="19"/>
+              </w:rPr>
+              <w:t>系统停止自动推进，展示原因、来源、候选和可执行人工动作。</w:t>
+            </w:r>
+          </w:p>
+        </w:tc>
+      </w:tr>
+      <w:tr>
+        <w:tc>
+          <w:tcPr>
+            <w:tcW w:type="dxa" w:w="3312"/>
+          </w:tcPr>
+          <w:p>
+            <w:r>
+              <w:rPr>
+                <w:rFonts w:ascii="宋体" w:hAnsi="宋体" w:eastAsia="宋体"/>
+                <w:b w:val="0"/>
+                <w:sz w:val="19"/>
+              </w:rPr>
+              <w:t>FR-050</w:t>
+            </w:r>
+          </w:p>
+        </w:tc>
+        <w:tc>
+          <w:tcPr>
+            <w:tcW w:type="dxa" w:w="3312"/>
+          </w:tcPr>
+          <w:p>
+            <w:r>
+              <w:rPr>
+                <w:rFonts w:ascii="宋体" w:hAnsi="宋体" w:eastAsia="宋体"/>
+                <w:b w:val="0"/>
+                <w:sz w:val="19"/>
+              </w:rPr>
+              <w:t>验收申请和检查记录草稿支持人工修正与补录。</w:t>
+            </w:r>
+          </w:p>
+        </w:tc>
+        <w:tc>
+          <w:tcPr>
+            <w:tcW w:type="dxa" w:w="3312"/>
+          </w:tcPr>
+          <w:p>
+            <w:r>
+              <w:rPr>
+                <w:rFonts w:ascii="宋体" w:hAnsi="宋体" w:eastAsia="宋体"/>
+                <w:b w:val="0"/>
+                <w:sz w:val="19"/>
+              </w:rPr>
+              <w:t>用户可修改项目、桩号、工程部位、类型、人员、描述、附件等字段；修改后进入既有表单确认。</w:t>
+            </w:r>
+          </w:p>
+        </w:tc>
+      </w:tr>
+      <w:tr>
+        <w:tc>
+          <w:tcPr>
+            <w:tcW w:type="dxa" w:w="3312"/>
+          </w:tcPr>
+          <w:p>
+            <w:r>
+              <w:rPr>
+                <w:rFonts w:ascii="宋体" w:hAnsi="宋体" w:eastAsia="宋体"/>
+                <w:b w:val="0"/>
+                <w:sz w:val="19"/>
+              </w:rPr>
+              <w:t>FR-051</w:t>
+            </w:r>
+          </w:p>
+        </w:tc>
+        <w:tc>
+          <w:tcPr>
+            <w:tcW w:type="dxa" w:w="3312"/>
+          </w:tcPr>
+          <w:p>
+            <w:r>
+              <w:rPr>
+                <w:rFonts w:ascii="宋体" w:hAnsi="宋体" w:eastAsia="宋体"/>
+                <w:b w:val="0"/>
+                <w:sz w:val="19"/>
+              </w:rPr>
+              <w:t>OCR 结果支持人工选择候选、手动绑定和标记未匹配。</w:t>
+            </w:r>
+          </w:p>
+        </w:tc>
+        <w:tc>
+          <w:tcPr>
+            <w:tcW w:type="dxa" w:w="3312"/>
+          </w:tcPr>
+          <w:p>
+            <w:r>
+              <w:rPr>
+                <w:rFonts w:ascii="宋体" w:hAnsi="宋体" w:eastAsia="宋体"/>
+                <w:b w:val="0"/>
+                <w:sz w:val="19"/>
+              </w:rPr>
+              <w:t>库内无匹配时不得自动新增基础库；用户可绑定已有对象或补录文本。</w:t>
+            </w:r>
+          </w:p>
+        </w:tc>
+      </w:tr>
+      <w:tr>
+        <w:tc>
+          <w:tcPr>
+            <w:tcW w:type="dxa" w:w="3312"/>
+          </w:tcPr>
+          <w:p>
+            <w:r>
+              <w:rPr>
+                <w:rFonts w:ascii="宋体" w:hAnsi="宋体" w:eastAsia="宋体"/>
+                <w:b w:val="0"/>
+                <w:sz w:val="19"/>
+              </w:rPr>
+              <w:t>FR-052</w:t>
+            </w:r>
+          </w:p>
+        </w:tc>
+        <w:tc>
+          <w:tcPr>
+            <w:tcW w:type="dxa" w:w="3312"/>
+          </w:tcPr>
+          <w:p>
+            <w:r>
+              <w:rPr>
+                <w:rFonts w:ascii="宋体" w:hAnsi="宋体" w:eastAsia="宋体"/>
+                <w:b w:val="0"/>
+                <w:sz w:val="19"/>
+              </w:rPr>
+              <w:t>RAG 无明确结果时支持人工搜索和候选选择。</w:t>
+            </w:r>
+          </w:p>
+        </w:tc>
+        <w:tc>
+          <w:tcPr>
+            <w:tcW w:type="dxa" w:w="3312"/>
+          </w:tcPr>
+          <w:p>
+            <w:r>
+              <w:rPr>
+                <w:rFonts w:ascii="宋体" w:hAnsi="宋体" w:eastAsia="宋体"/>
+                <w:b w:val="0"/>
+                <w:sz w:val="19"/>
+              </w:rPr>
+              <w:t>不编造指南答案；展示关键词建议、候选指南或人工搜索入口。</w:t>
+            </w:r>
+          </w:p>
+        </w:tc>
+      </w:tr>
+      <w:tr>
+        <w:tc>
+          <w:tcPr>
+            <w:tcW w:type="dxa" w:w="3312"/>
+          </w:tcPr>
+          <w:p>
+            <w:r>
+              <w:rPr>
+                <w:rFonts w:ascii="宋体" w:hAnsi="宋体" w:eastAsia="宋体"/>
+                <w:b w:val="0"/>
+                <w:sz w:val="19"/>
+              </w:rPr>
+              <w:t>FR-053</w:t>
+            </w:r>
+          </w:p>
+        </w:tc>
+        <w:tc>
+          <w:tcPr>
+            <w:tcW w:type="dxa" w:w="3312"/>
+          </w:tcPr>
+          <w:p>
+            <w:r>
+              <w:rPr>
+                <w:rFonts w:ascii="宋体" w:hAnsi="宋体" w:eastAsia="宋体"/>
+                <w:b w:val="0"/>
+                <w:sz w:val="19"/>
+              </w:rPr>
+              <w:t>工具调用失败或 AI 服务不可用时保留人工主流程。</w:t>
+            </w:r>
+          </w:p>
+        </w:tc>
+        <w:tc>
+          <w:tcPr>
+            <w:tcW w:type="dxa" w:w="3312"/>
+          </w:tcPr>
+          <w:p>
+            <w:r>
+              <w:rPr>
+                <w:rFonts w:ascii="宋体" w:hAnsi="宋体" w:eastAsia="宋体"/>
+                <w:b w:val="0"/>
+                <w:sz w:val="19"/>
+              </w:rPr>
+              <w:t>用户可打开空白/半预填表单、上传附件、手动挂接或稍后重试。</w:t>
+            </w:r>
+          </w:p>
+        </w:tc>
+      </w:tr>
+      <w:tr>
+        <w:tc>
+          <w:tcPr>
+            <w:tcW w:type="dxa" w:w="3312"/>
+          </w:tcPr>
+          <w:p>
+            <w:r>
+              <w:rPr>
+                <w:rFonts w:ascii="宋体" w:hAnsi="宋体" w:eastAsia="宋体"/>
+                <w:b w:val="0"/>
+                <w:sz w:val="19"/>
+              </w:rPr>
+              <w:t>FR-054</w:t>
+            </w:r>
+          </w:p>
+        </w:tc>
+        <w:tc>
+          <w:tcPr>
+            <w:tcW w:type="dxa" w:w="3312"/>
+          </w:tcPr>
+          <w:p>
+            <w:r>
+              <w:rPr>
+                <w:rFonts w:ascii="宋体" w:hAnsi="宋体" w:eastAsia="宋体"/>
+                <w:b w:val="0"/>
+                <w:sz w:val="19"/>
+              </w:rPr>
+              <w:t>人工兜底过程必须形成记录。</w:t>
+            </w:r>
+          </w:p>
+        </w:tc>
+        <w:tc>
+          <w:tcPr>
+            <w:tcW w:type="dxa" w:w="3312"/>
+          </w:tcPr>
+          <w:p>
+            <w:r>
+              <w:rPr>
+                <w:rFonts w:ascii="宋体" w:hAnsi="宋体" w:eastAsia="宋体"/>
+                <w:b w:val="0"/>
+                <w:sz w:val="19"/>
+              </w:rPr>
+              <w:t>记录触发原因、AI 原值、用户修改值、处理人、处理时间、最终业务对象和状态。</w:t>
+            </w:r>
+          </w:p>
+        </w:tc>
+      </w:tr>
+      <w:tr>
+        <w:tc>
+          <w:tcPr>
+            <w:tcW w:type="dxa" w:w="3312"/>
+          </w:tcPr>
+          <w:p>
+            <w:r>
+              <w:rPr>
+                <w:rFonts w:ascii="宋体" w:hAnsi="宋体" w:eastAsia="宋体"/>
+                <w:b w:val="0"/>
+                <w:sz w:val="19"/>
+              </w:rPr>
+              <w:t>FR-055</w:t>
+            </w:r>
+          </w:p>
+        </w:tc>
+        <w:tc>
+          <w:tcPr>
+            <w:tcW w:type="dxa" w:w="3312"/>
+          </w:tcPr>
+          <w:p>
+            <w:r>
+              <w:rPr>
+                <w:rFonts w:ascii="宋体" w:hAnsi="宋体" w:eastAsia="宋体"/>
+                <w:b w:val="0"/>
+                <w:sz w:val="19"/>
+              </w:rPr>
+              <w:t>人工兜底样本进入运营复核池。</w:t>
+            </w:r>
+          </w:p>
+        </w:tc>
+        <w:tc>
+          <w:tcPr>
+            <w:tcW w:type="dxa" w:w="3312"/>
+          </w:tcPr>
+          <w:p>
+            <w:r>
+              <w:rPr>
+                <w:rFonts w:ascii="宋体" w:hAnsi="宋体" w:eastAsia="宋体"/>
+                <w:b w:val="0"/>
+                <w:sz w:val="19"/>
+              </w:rPr>
+              <w:t>被修改、否定、人工绑定、低置信度和失败样本可按权限查看、复核和纳入规则优化。</w:t>
             </w:r>
           </w:p>
         </w:tc>
@@ -9048,6 +11085,375 @@
     <w:p/>
     <w:p>
       <w:pPr>
+        <w:pStyle w:val="Heading3"/>
+        <w:jc w:val="left"/>
+      </w:pPr>
+      <w:r>
+        <w:rPr>
+          <w:rFonts w:ascii="宋体" w:hAnsi="宋体" w:eastAsia="宋体"/>
+          <w:b/>
+          <w:sz w:val="24"/>
+        </w:rPr>
+        <w:t>8.7 人工兜底交互</w:t>
+      </w:r>
+    </w:p>
+    <w:p>
+      <w:pPr>
+        <w:spacing w:before="0" w:after="80" w:line="360" w:lineRule="auto"/>
+      </w:pPr>
+      <w:r>
+        <w:rPr>
+          <w:rFonts w:ascii="宋体" w:hAnsi="宋体" w:eastAsia="宋体"/>
+          <w:b w:val="0"/>
+          <w:sz w:val="21"/>
+        </w:rPr>
+        <w:t>人工兜底交互必须出现在 AI 会话卡片、OCR 确认页、表单草稿卡和固定确认页中。系统不得只展示错误文本后中断流程。</w:t>
+      </w:r>
+    </w:p>
+    <w:tbl>
+      <w:tblPr>
+        <w:tblStyle w:val="TableGrid"/>
+        <w:tblW w:type="auto" w:w="0"/>
+        <w:tblLook w:firstColumn="1" w:firstRow="1" w:lastColumn="0" w:lastRow="0" w:noHBand="0" w:noVBand="1" w:val="04A0"/>
+      </w:tblPr>
+      <w:tblGrid>
+        <w:gridCol w:w="3312"/>
+        <w:gridCol w:w="3312"/>
+        <w:gridCol w:w="3312"/>
+      </w:tblGrid>
+      <w:tr>
+        <w:tc>
+          <w:tcPr>
+            <w:tcW w:type="dxa" w:w="3312"/>
+          </w:tcPr>
+          <w:p>
+            <w:r>
+              <w:rPr>
+                <w:rFonts w:ascii="宋体" w:hAnsi="宋体" w:eastAsia="宋体"/>
+                <w:b/>
+                <w:sz w:val="19"/>
+              </w:rPr>
+              <w:t>交互元素</w:t>
+            </w:r>
+          </w:p>
+        </w:tc>
+        <w:tc>
+          <w:tcPr>
+            <w:tcW w:type="dxa" w:w="3312"/>
+          </w:tcPr>
+          <w:p>
+            <w:r>
+              <w:rPr>
+                <w:rFonts w:ascii="宋体" w:hAnsi="宋体" w:eastAsia="宋体"/>
+                <w:b/>
+                <w:sz w:val="19"/>
+              </w:rPr>
+              <w:t>展示内容</w:t>
+            </w:r>
+          </w:p>
+        </w:tc>
+        <w:tc>
+          <w:tcPr>
+            <w:tcW w:type="dxa" w:w="3312"/>
+          </w:tcPr>
+          <w:p>
+            <w:r>
+              <w:rPr>
+                <w:rFonts w:ascii="宋体" w:hAnsi="宋体" w:eastAsia="宋体"/>
+                <w:b/>
+                <w:sz w:val="19"/>
+              </w:rPr>
+              <w:t>操作要求</w:t>
+            </w:r>
+          </w:p>
+        </w:tc>
+      </w:tr>
+      <w:tr>
+        <w:tc>
+          <w:tcPr>
+            <w:tcW w:type="dxa" w:w="3312"/>
+          </w:tcPr>
+          <w:p>
+            <w:r>
+              <w:rPr>
+                <w:rFonts w:ascii="宋体" w:hAnsi="宋体" w:eastAsia="宋体"/>
+                <w:b w:val="0"/>
+                <w:sz w:val="19"/>
+              </w:rPr>
+              <w:t>兜底原因</w:t>
+            </w:r>
+          </w:p>
+        </w:tc>
+        <w:tc>
+          <w:tcPr>
+            <w:tcW w:type="dxa" w:w="3312"/>
+          </w:tcPr>
+          <w:p>
+            <w:r>
+              <w:rPr>
+                <w:rFonts w:ascii="宋体" w:hAnsi="宋体" w:eastAsia="宋体"/>
+                <w:b w:val="0"/>
+                <w:sz w:val="19"/>
+              </w:rPr>
+              <w:t>意图不明、字段缺失、低置信度、多候选、识别错误、权限不足、工具失败</w:t>
+            </w:r>
+          </w:p>
+        </w:tc>
+        <w:tc>
+          <w:tcPr>
+            <w:tcW w:type="dxa" w:w="3312"/>
+          </w:tcPr>
+          <w:p>
+            <w:r>
+              <w:rPr>
+                <w:rFonts w:ascii="宋体" w:hAnsi="宋体" w:eastAsia="宋体"/>
+                <w:b w:val="0"/>
+                <w:sz w:val="19"/>
+              </w:rPr>
+              <w:t>使用明确业务语言说明，不展示模型内部推理。</w:t>
+            </w:r>
+          </w:p>
+        </w:tc>
+      </w:tr>
+      <w:tr>
+        <w:tc>
+          <w:tcPr>
+            <w:tcW w:type="dxa" w:w="3312"/>
+          </w:tcPr>
+          <w:p>
+            <w:r>
+              <w:rPr>
+                <w:rFonts w:ascii="宋体" w:hAnsi="宋体" w:eastAsia="宋体"/>
+                <w:b w:val="0"/>
+                <w:sz w:val="19"/>
+              </w:rPr>
+              <w:t>AI 原始结果</w:t>
+            </w:r>
+          </w:p>
+        </w:tc>
+        <w:tc>
+          <w:tcPr>
+            <w:tcW w:type="dxa" w:w="3312"/>
+          </w:tcPr>
+          <w:p>
+            <w:r>
+              <w:rPr>
+                <w:rFonts w:ascii="宋体" w:hAnsi="宋体" w:eastAsia="宋体"/>
+                <w:b w:val="0"/>
+                <w:sz w:val="19"/>
+              </w:rPr>
+              <w:t>AI 识别字段、候选、置信状态、来源文本或图片页码</w:t>
+            </w:r>
+          </w:p>
+        </w:tc>
+        <w:tc>
+          <w:tcPr>
+            <w:tcW w:type="dxa" w:w="3312"/>
+          </w:tcPr>
+          <w:p>
+            <w:r>
+              <w:rPr>
+                <w:rFonts w:ascii="宋体" w:hAnsi="宋体" w:eastAsia="宋体"/>
+                <w:b w:val="0"/>
+                <w:sz w:val="19"/>
+              </w:rPr>
+              <w:t>只展示当前用户有权查看的数据。</w:t>
+            </w:r>
+          </w:p>
+        </w:tc>
+      </w:tr>
+      <w:tr>
+        <w:tc>
+          <w:tcPr>
+            <w:tcW w:type="dxa" w:w="3312"/>
+          </w:tcPr>
+          <w:p>
+            <w:r>
+              <w:rPr>
+                <w:rFonts w:ascii="宋体" w:hAnsi="宋体" w:eastAsia="宋体"/>
+                <w:b w:val="0"/>
+                <w:sz w:val="19"/>
+              </w:rPr>
+              <w:t>人工处理入口</w:t>
+            </w:r>
+          </w:p>
+        </w:tc>
+        <w:tc>
+          <w:tcPr>
+            <w:tcW w:type="dxa" w:w="3312"/>
+          </w:tcPr>
+          <w:p>
+            <w:r>
+              <w:rPr>
+                <w:rFonts w:ascii="宋体" w:hAnsi="宋体" w:eastAsia="宋体"/>
+                <w:b w:val="0"/>
+                <w:sz w:val="19"/>
+              </w:rPr>
+              <w:t>选择候选、修改字段、补录字段、人工绑定、打开表单、重试、作废</w:t>
+            </w:r>
+          </w:p>
+        </w:tc>
+        <w:tc>
+          <w:tcPr>
+            <w:tcW w:type="dxa" w:w="3312"/>
+          </w:tcPr>
+          <w:p>
+            <w:r>
+              <w:rPr>
+                <w:rFonts w:ascii="宋体" w:hAnsi="宋体" w:eastAsia="宋体"/>
+                <w:b w:val="0"/>
+                <w:sz w:val="19"/>
+              </w:rPr>
+              <w:t>按任务类型和权限展示可用按钮。</w:t>
+            </w:r>
+          </w:p>
+        </w:tc>
+      </w:tr>
+      <w:tr>
+        <w:tc>
+          <w:tcPr>
+            <w:tcW w:type="dxa" w:w="3312"/>
+          </w:tcPr>
+          <w:p>
+            <w:r>
+              <w:rPr>
+                <w:rFonts w:ascii="宋体" w:hAnsi="宋体" w:eastAsia="宋体"/>
+                <w:b w:val="0"/>
+                <w:sz w:val="19"/>
+              </w:rPr>
+              <w:t>字段修正区</w:t>
+            </w:r>
+          </w:p>
+        </w:tc>
+        <w:tc>
+          <w:tcPr>
+            <w:tcW w:type="dxa" w:w="3312"/>
+          </w:tcPr>
+          <w:p>
+            <w:r>
+              <w:rPr>
+                <w:rFonts w:ascii="宋体" w:hAnsi="宋体" w:eastAsia="宋体"/>
+                <w:b w:val="0"/>
+                <w:sz w:val="19"/>
+              </w:rPr>
+              <w:t>原值、建议值、用户值、修改原因</w:t>
+            </w:r>
+          </w:p>
+        </w:tc>
+        <w:tc>
+          <w:tcPr>
+            <w:tcW w:type="dxa" w:w="3312"/>
+          </w:tcPr>
+          <w:p>
+            <w:r>
+              <w:rPr>
+                <w:rFonts w:ascii="宋体" w:hAnsi="宋体" w:eastAsia="宋体"/>
+                <w:b w:val="0"/>
+                <w:sz w:val="19"/>
+              </w:rPr>
+              <w:t>用户修改后必须重新执行字段校验。</w:t>
+            </w:r>
+          </w:p>
+        </w:tc>
+      </w:tr>
+      <w:tr>
+        <w:tc>
+          <w:tcPr>
+            <w:tcW w:type="dxa" w:w="3312"/>
+          </w:tcPr>
+          <w:p>
+            <w:r>
+              <w:rPr>
+                <w:rFonts w:ascii="宋体" w:hAnsi="宋体" w:eastAsia="宋体"/>
+                <w:b w:val="0"/>
+                <w:sz w:val="19"/>
+              </w:rPr>
+              <w:t>手工办理入口</w:t>
+            </w:r>
+          </w:p>
+        </w:tc>
+        <w:tc>
+          <w:tcPr>
+            <w:tcW w:type="dxa" w:w="3312"/>
+          </w:tcPr>
+          <w:p>
+            <w:r>
+              <w:rPr>
+                <w:rFonts w:ascii="宋体" w:hAnsi="宋体" w:eastAsia="宋体"/>
+                <w:b w:val="0"/>
+                <w:sz w:val="19"/>
+              </w:rPr>
+              <w:t>空白表单、半预填表单、人工搜索、人工挂接附件</w:t>
+            </w:r>
+          </w:p>
+        </w:tc>
+        <w:tc>
+          <w:tcPr>
+            <w:tcW w:type="dxa" w:w="3312"/>
+          </w:tcPr>
+          <w:p>
+            <w:r>
+              <w:rPr>
+                <w:rFonts w:ascii="宋体" w:hAnsi="宋体" w:eastAsia="宋体"/>
+                <w:b w:val="0"/>
+                <w:sz w:val="19"/>
+              </w:rPr>
+              <w:t>保留已上传文件、已识别文本和上下文摘要。</w:t>
+            </w:r>
+          </w:p>
+        </w:tc>
+      </w:tr>
+      <w:tr>
+        <w:tc>
+          <w:tcPr>
+            <w:tcW w:type="dxa" w:w="3312"/>
+          </w:tcPr>
+          <w:p>
+            <w:r>
+              <w:rPr>
+                <w:rFonts w:ascii="宋体" w:hAnsi="宋体" w:eastAsia="宋体"/>
+                <w:b w:val="0"/>
+                <w:sz w:val="19"/>
+              </w:rPr>
+              <w:t>完成反馈</w:t>
+            </w:r>
+          </w:p>
+        </w:tc>
+        <w:tc>
+          <w:tcPr>
+            <w:tcW w:type="dxa" w:w="3312"/>
+          </w:tcPr>
+          <w:p>
+            <w:r>
+              <w:rPr>
+                <w:rFonts w:ascii="宋体" w:hAnsi="宋体" w:eastAsia="宋体"/>
+                <w:b w:val="0"/>
+                <w:sz w:val="19"/>
+              </w:rPr>
+              <w:t>人工处理结果、业务单号、最终状态、审计编号</w:t>
+            </w:r>
+          </w:p>
+        </w:tc>
+        <w:tc>
+          <w:tcPr>
+            <w:tcW w:type="dxa" w:w="3312"/>
+          </w:tcPr>
+          <w:p>
+            <w:r>
+              <w:rPr>
+                <w:rFonts w:ascii="宋体" w:hAnsi="宋体" w:eastAsia="宋体"/>
+                <w:b w:val="0"/>
+                <w:sz w:val="19"/>
+              </w:rPr>
+              <w:t>回写任务节点并进入历史会话。</w:t>
+            </w:r>
+          </w:p>
+        </w:tc>
+      </w:tr>
+    </w:tbl>
+    <w:p/>
+    <w:p>
+      <w:pPr>
         <w:pStyle w:val="Heading2"/>
         <w:jc w:val="left"/>
       </w:pPr>
@@ -9602,6 +12008,100 @@
           </w:p>
         </w:tc>
       </w:tr>
+      <w:tr>
+        <w:tc>
+          <w:tcPr>
+            <w:tcW w:type="dxa" w:w="3312"/>
+          </w:tcPr>
+          <w:p>
+            <w:r>
+              <w:rPr>
+                <w:rFonts w:ascii="宋体" w:hAnsi="宋体" w:eastAsia="宋体"/>
+                <w:b w:val="0"/>
+                <w:sz w:val="19"/>
+              </w:rPr>
+              <w:t>人工兜底记录</w:t>
+            </w:r>
+          </w:p>
+        </w:tc>
+        <w:tc>
+          <w:tcPr>
+            <w:tcW w:type="dxa" w:w="3312"/>
+          </w:tcPr>
+          <w:p>
+            <w:r>
+              <w:rPr>
+                <w:rFonts w:ascii="宋体" w:hAnsi="宋体" w:eastAsia="宋体"/>
+                <w:b w:val="0"/>
+                <w:sz w:val="19"/>
+              </w:rPr>
+              <w:t>兜底ID、任务ID、触发原因、AI 原值、用户处理值、处理人、处理时间、最终状态</w:t>
+            </w:r>
+          </w:p>
+        </w:tc>
+        <w:tc>
+          <w:tcPr>
+            <w:tcW w:type="dxa" w:w="3312"/>
+          </w:tcPr>
+          <w:p>
+            <w:r>
+              <w:rPr>
+                <w:rFonts w:ascii="宋体" w:hAnsi="宋体" w:eastAsia="宋体"/>
+                <w:b w:val="0"/>
+                <w:sz w:val="19"/>
+              </w:rPr>
+              <w:t>追踪 AI 不确定或失败后的人工处理闭环。</w:t>
+            </w:r>
+          </w:p>
+        </w:tc>
+      </w:tr>
+      <w:tr>
+        <w:tc>
+          <w:tcPr>
+            <w:tcW w:type="dxa" w:w="3312"/>
+          </w:tcPr>
+          <w:p>
+            <w:r>
+              <w:rPr>
+                <w:rFonts w:ascii="宋体" w:hAnsi="宋体" w:eastAsia="宋体"/>
+                <w:b w:val="0"/>
+                <w:sz w:val="19"/>
+              </w:rPr>
+              <w:t>复核样本池</w:t>
+            </w:r>
+          </w:p>
+        </w:tc>
+        <w:tc>
+          <w:tcPr>
+            <w:tcW w:type="dxa" w:w="3312"/>
+          </w:tcPr>
+          <w:p>
+            <w:r>
+              <w:rPr>
+                <w:rFonts w:ascii="宋体" w:hAnsi="宋体" w:eastAsia="宋体"/>
+                <w:b w:val="0"/>
+                <w:sz w:val="19"/>
+              </w:rPr>
+              <w:t>样本ID、样本类型、来源任务、AI 输出、用户修正、复核状态、复核结论</w:t>
+            </w:r>
+          </w:p>
+        </w:tc>
+        <w:tc>
+          <w:tcPr>
+            <w:tcW w:type="dxa" w:w="3312"/>
+          </w:tcPr>
+          <w:p>
+            <w:r>
+              <w:rPr>
+                <w:rFonts w:ascii="宋体" w:hAnsi="宋体" w:eastAsia="宋体"/>
+                <w:b w:val="0"/>
+                <w:sz w:val="19"/>
+              </w:rPr>
+              <w:t>支撑规则、模板、知识库和模型优化。</w:t>
+            </w:r>
+          </w:p>
+        </w:tc>
+      </w:tr>
     </w:tbl>
     <w:p/>
     <w:p>
@@ -10865,6 +13365,316 @@
                 <w:sz w:val="19"/>
               </w:rPr>
               <w:t>filter_type、result_count</w:t>
+            </w:r>
+          </w:p>
+        </w:tc>
+      </w:tr>
+      <w:tr>
+        <w:tc>
+          <w:tcPr>
+            <w:tcW w:type="dxa" w:w="2484"/>
+          </w:tcPr>
+          <w:p>
+            <w:r>
+              <w:rPr>
+                <w:rFonts w:ascii="宋体" w:hAnsi="宋体" w:eastAsia="宋体"/>
+                <w:b w:val="0"/>
+                <w:sz w:val="19"/>
+              </w:rPr>
+              <w:t>EVT-015</w:t>
+            </w:r>
+          </w:p>
+        </w:tc>
+        <w:tc>
+          <w:tcPr>
+            <w:tcW w:type="dxa" w:w="2484"/>
+          </w:tcPr>
+          <w:p>
+            <w:r>
+              <w:rPr>
+                <w:rFonts w:ascii="宋体" w:hAnsi="宋体" w:eastAsia="宋体"/>
+                <w:b w:val="0"/>
+                <w:sz w:val="19"/>
+              </w:rPr>
+              <w:t>ai_manual_fallback_start</w:t>
+            </w:r>
+          </w:p>
+        </w:tc>
+        <w:tc>
+          <w:tcPr>
+            <w:tcW w:type="dxa" w:w="2484"/>
+          </w:tcPr>
+          <w:p>
+            <w:r>
+              <w:rPr>
+                <w:rFonts w:ascii="宋体" w:hAnsi="宋体" w:eastAsia="宋体"/>
+                <w:b w:val="0"/>
+                <w:sz w:val="19"/>
+              </w:rPr>
+              <w:t>系统进入人工兜底</w:t>
+            </w:r>
+          </w:p>
+        </w:tc>
+        <w:tc>
+          <w:tcPr>
+            <w:tcW w:type="dxa" w:w="2484"/>
+          </w:tcPr>
+          <w:p>
+            <w:r>
+              <w:rPr>
+                <w:rFonts w:ascii="宋体" w:hAnsi="宋体" w:eastAsia="宋体"/>
+                <w:b w:val="0"/>
+                <w:sz w:val="19"/>
+              </w:rPr>
+              <w:t>task_id、fallback_reason、source_module、confidence_level</w:t>
+            </w:r>
+          </w:p>
+        </w:tc>
+      </w:tr>
+      <w:tr>
+        <w:tc>
+          <w:tcPr>
+            <w:tcW w:type="dxa" w:w="2484"/>
+          </w:tcPr>
+          <w:p>
+            <w:r>
+              <w:rPr>
+                <w:rFonts w:ascii="宋体" w:hAnsi="宋体" w:eastAsia="宋体"/>
+                <w:b w:val="0"/>
+                <w:sz w:val="19"/>
+              </w:rPr>
+              <w:t>EVT-016</w:t>
+            </w:r>
+          </w:p>
+        </w:tc>
+        <w:tc>
+          <w:tcPr>
+            <w:tcW w:type="dxa" w:w="2484"/>
+          </w:tcPr>
+          <w:p>
+            <w:r>
+              <w:rPr>
+                <w:rFonts w:ascii="宋体" w:hAnsi="宋体" w:eastAsia="宋体"/>
+                <w:b w:val="0"/>
+                <w:sz w:val="19"/>
+              </w:rPr>
+              <w:t>ai_manual_field_correct</w:t>
+            </w:r>
+          </w:p>
+        </w:tc>
+        <w:tc>
+          <w:tcPr>
+            <w:tcW w:type="dxa" w:w="2484"/>
+          </w:tcPr>
+          <w:p>
+            <w:r>
+              <w:rPr>
+                <w:rFonts w:ascii="宋体" w:hAnsi="宋体" w:eastAsia="宋体"/>
+                <w:b w:val="0"/>
+                <w:sz w:val="19"/>
+              </w:rPr>
+              <w:t>用户修改 AI 字段</w:t>
+            </w:r>
+          </w:p>
+        </w:tc>
+        <w:tc>
+          <w:tcPr>
+            <w:tcW w:type="dxa" w:w="2484"/>
+          </w:tcPr>
+          <w:p>
+            <w:r>
+              <w:rPr>
+                <w:rFonts w:ascii="宋体" w:hAnsi="宋体" w:eastAsia="宋体"/>
+                <w:b w:val="0"/>
+                <w:sz w:val="19"/>
+              </w:rPr>
+              <w:t>task_id、field_code、source_value_type、reason_code</w:t>
+            </w:r>
+          </w:p>
+        </w:tc>
+      </w:tr>
+      <w:tr>
+        <w:tc>
+          <w:tcPr>
+            <w:tcW w:type="dxa" w:w="2484"/>
+          </w:tcPr>
+          <w:p>
+            <w:r>
+              <w:rPr>
+                <w:rFonts w:ascii="宋体" w:hAnsi="宋体" w:eastAsia="宋体"/>
+                <w:b w:val="0"/>
+                <w:sz w:val="19"/>
+              </w:rPr>
+              <w:t>EVT-017</w:t>
+            </w:r>
+          </w:p>
+        </w:tc>
+        <w:tc>
+          <w:tcPr>
+            <w:tcW w:type="dxa" w:w="2484"/>
+          </w:tcPr>
+          <w:p>
+            <w:r>
+              <w:rPr>
+                <w:rFonts w:ascii="宋体" w:hAnsi="宋体" w:eastAsia="宋体"/>
+                <w:b w:val="0"/>
+                <w:sz w:val="19"/>
+              </w:rPr>
+              <w:t>ai_manual_bind</w:t>
+            </w:r>
+          </w:p>
+        </w:tc>
+        <w:tc>
+          <w:tcPr>
+            <w:tcW w:type="dxa" w:w="2484"/>
+          </w:tcPr>
+          <w:p>
+            <w:r>
+              <w:rPr>
+                <w:rFonts w:ascii="宋体" w:hAnsi="宋体" w:eastAsia="宋体"/>
+                <w:b w:val="0"/>
+                <w:sz w:val="19"/>
+              </w:rPr>
+              <w:t>用户人工绑定业务对象</w:t>
+            </w:r>
+          </w:p>
+        </w:tc>
+        <w:tc>
+          <w:tcPr>
+            <w:tcW w:type="dxa" w:w="2484"/>
+          </w:tcPr>
+          <w:p>
+            <w:r>
+              <w:rPr>
+                <w:rFonts w:ascii="宋体" w:hAnsi="宋体" w:eastAsia="宋体"/>
+                <w:b w:val="0"/>
+                <w:sz w:val="19"/>
+              </w:rPr>
+              <w:t>task_id、object_type、candidate_count、bind_result</w:t>
+            </w:r>
+          </w:p>
+        </w:tc>
+      </w:tr>
+      <w:tr>
+        <w:tc>
+          <w:tcPr>
+            <w:tcW w:type="dxa" w:w="2484"/>
+          </w:tcPr>
+          <w:p>
+            <w:r>
+              <w:rPr>
+                <w:rFonts w:ascii="宋体" w:hAnsi="宋体" w:eastAsia="宋体"/>
+                <w:b w:val="0"/>
+                <w:sz w:val="19"/>
+              </w:rPr>
+              <w:t>EVT-018</w:t>
+            </w:r>
+          </w:p>
+        </w:tc>
+        <w:tc>
+          <w:tcPr>
+            <w:tcW w:type="dxa" w:w="2484"/>
+          </w:tcPr>
+          <w:p>
+            <w:r>
+              <w:rPr>
+                <w:rFonts w:ascii="宋体" w:hAnsi="宋体" w:eastAsia="宋体"/>
+                <w:b w:val="0"/>
+                <w:sz w:val="19"/>
+              </w:rPr>
+              <w:t>ai_manual_fallback_complete</w:t>
+            </w:r>
+          </w:p>
+        </w:tc>
+        <w:tc>
+          <w:tcPr>
+            <w:tcW w:type="dxa" w:w="2484"/>
+          </w:tcPr>
+          <w:p>
+            <w:r>
+              <w:rPr>
+                <w:rFonts w:ascii="宋体" w:hAnsi="宋体" w:eastAsia="宋体"/>
+                <w:b w:val="0"/>
+                <w:sz w:val="19"/>
+              </w:rPr>
+              <w:t>人工兜底完成</w:t>
+            </w:r>
+          </w:p>
+        </w:tc>
+        <w:tc>
+          <w:tcPr>
+            <w:tcW w:type="dxa" w:w="2484"/>
+          </w:tcPr>
+          <w:p>
+            <w:r>
+              <w:rPr>
+                <w:rFonts w:ascii="宋体" w:hAnsi="宋体" w:eastAsia="宋体"/>
+                <w:b w:val="0"/>
+                <w:sz w:val="19"/>
+              </w:rPr>
+              <w:t>task_id、final_status、business_id、duration_seconds</w:t>
+            </w:r>
+          </w:p>
+        </w:tc>
+      </w:tr>
+      <w:tr>
+        <w:tc>
+          <w:tcPr>
+            <w:tcW w:type="dxa" w:w="2484"/>
+          </w:tcPr>
+          <w:p>
+            <w:r>
+              <w:rPr>
+                <w:rFonts w:ascii="宋体" w:hAnsi="宋体" w:eastAsia="宋体"/>
+                <w:b w:val="0"/>
+                <w:sz w:val="19"/>
+              </w:rPr>
+              <w:t>EVT-019</w:t>
+            </w:r>
+          </w:p>
+        </w:tc>
+        <w:tc>
+          <w:tcPr>
+            <w:tcW w:type="dxa" w:w="2484"/>
+          </w:tcPr>
+          <w:p>
+            <w:r>
+              <w:rPr>
+                <w:rFonts w:ascii="宋体" w:hAnsi="宋体" w:eastAsia="宋体"/>
+                <w:b w:val="0"/>
+                <w:sz w:val="19"/>
+              </w:rPr>
+              <w:t>ai_review_sample_submit</w:t>
+            </w:r>
+          </w:p>
+        </w:tc>
+        <w:tc>
+          <w:tcPr>
+            <w:tcW w:type="dxa" w:w="2484"/>
+          </w:tcPr>
+          <w:p>
+            <w:r>
+              <w:rPr>
+                <w:rFonts w:ascii="宋体" w:hAnsi="宋体" w:eastAsia="宋体"/>
+                <w:b w:val="0"/>
+                <w:sz w:val="19"/>
+              </w:rPr>
+              <w:t>样本进入复核池</w:t>
+            </w:r>
+          </w:p>
+        </w:tc>
+        <w:tc>
+          <w:tcPr>
+            <w:tcW w:type="dxa" w:w="2484"/>
+          </w:tcPr>
+          <w:p>
+            <w:r>
+              <w:rPr>
+                <w:rFonts w:ascii="宋体" w:hAnsi="宋体" w:eastAsia="宋体"/>
+                <w:b w:val="0"/>
+                <w:sz w:val="19"/>
+              </w:rPr>
+              <w:t>sample_type、source_task、review_priority</w:t>
             </w:r>
           </w:p>
         </w:tc>
@@ -12085,6 +14895,372 @@
                 <w:b w:val="0"/>
                 <w:sz w:val="19"/>
               </w:rPr>
+              <w:t>人工修正/补录</w:t>
+            </w:r>
+          </w:p>
+        </w:tc>
+        <w:tc>
+          <w:tcPr>
+            <w:tcW w:type="dxa" w:w="1242"/>
+          </w:tcPr>
+          <w:p>
+            <w:r>
+              <w:rPr>
+                <w:rFonts w:ascii="宋体" w:hAnsi="宋体" w:eastAsia="宋体"/>
+                <w:b w:val="0"/>
+                <w:sz w:val="19"/>
+              </w:rPr>
+              <w:t>授权项目</w:t>
+            </w:r>
+          </w:p>
+        </w:tc>
+        <w:tc>
+          <w:tcPr>
+            <w:tcW w:type="dxa" w:w="1242"/>
+          </w:tcPr>
+          <w:p>
+            <w:r>
+              <w:rPr>
+                <w:rFonts w:ascii="宋体" w:hAnsi="宋体" w:eastAsia="宋体"/>
+                <w:b w:val="0"/>
+                <w:sz w:val="19"/>
+              </w:rPr>
+              <w:t>授权项目</w:t>
+            </w:r>
+          </w:p>
+        </w:tc>
+        <w:tc>
+          <w:tcPr>
+            <w:tcW w:type="dxa" w:w="1242"/>
+          </w:tcPr>
+          <w:p>
+            <w:r>
+              <w:rPr>
+                <w:rFonts w:ascii="宋体" w:hAnsi="宋体" w:eastAsia="宋体"/>
+                <w:b w:val="0"/>
+                <w:sz w:val="19"/>
+              </w:rPr>
+              <w:t>否</w:t>
+            </w:r>
+          </w:p>
+        </w:tc>
+        <w:tc>
+          <w:tcPr>
+            <w:tcW w:type="dxa" w:w="1242"/>
+          </w:tcPr>
+          <w:p>
+            <w:r>
+              <w:rPr>
+                <w:rFonts w:ascii="宋体" w:hAnsi="宋体" w:eastAsia="宋体"/>
+                <w:b w:val="0"/>
+                <w:sz w:val="19"/>
+              </w:rPr>
+              <w:t>授权项目</w:t>
+            </w:r>
+          </w:p>
+        </w:tc>
+        <w:tc>
+          <w:tcPr>
+            <w:tcW w:type="dxa" w:w="1242"/>
+          </w:tcPr>
+          <w:p>
+            <w:r>
+              <w:rPr>
+                <w:rFonts w:ascii="宋体" w:hAnsi="宋体" w:eastAsia="宋体"/>
+                <w:b w:val="0"/>
+                <w:sz w:val="19"/>
+              </w:rPr>
+              <w:t>否</w:t>
+            </w:r>
+          </w:p>
+        </w:tc>
+        <w:tc>
+          <w:tcPr>
+            <w:tcW w:type="dxa" w:w="1242"/>
+          </w:tcPr>
+          <w:p>
+            <w:r>
+              <w:rPr>
+                <w:rFonts w:ascii="宋体" w:hAnsi="宋体" w:eastAsia="宋体"/>
+                <w:b w:val="0"/>
+                <w:sz w:val="19"/>
+              </w:rPr>
+              <w:t>否</w:t>
+            </w:r>
+          </w:p>
+        </w:tc>
+        <w:tc>
+          <w:tcPr>
+            <w:tcW w:type="dxa" w:w="1242"/>
+          </w:tcPr>
+          <w:p>
+            <w:r>
+              <w:rPr>
+                <w:rFonts w:ascii="宋体" w:hAnsi="宋体" w:eastAsia="宋体"/>
+                <w:b w:val="0"/>
+                <w:sz w:val="19"/>
+              </w:rPr>
+              <w:t>否</w:t>
+            </w:r>
+          </w:p>
+        </w:tc>
+      </w:tr>
+      <w:tr>
+        <w:tc>
+          <w:tcPr>
+            <w:tcW w:type="dxa" w:w="1242"/>
+          </w:tcPr>
+          <w:p>
+            <w:r>
+              <w:rPr>
+                <w:rFonts w:ascii="宋体" w:hAnsi="宋体" w:eastAsia="宋体"/>
+                <w:b w:val="0"/>
+                <w:sz w:val="19"/>
+              </w:rPr>
+              <w:t>已确认批次改绑/作废</w:t>
+            </w:r>
+          </w:p>
+        </w:tc>
+        <w:tc>
+          <w:tcPr>
+            <w:tcW w:type="dxa" w:w="1242"/>
+          </w:tcPr>
+          <w:p>
+            <w:r>
+              <w:rPr>
+                <w:rFonts w:ascii="宋体" w:hAnsi="宋体" w:eastAsia="宋体"/>
+                <w:b w:val="0"/>
+                <w:sz w:val="19"/>
+              </w:rPr>
+              <w:t>否</w:t>
+            </w:r>
+          </w:p>
+        </w:tc>
+        <w:tc>
+          <w:tcPr>
+            <w:tcW w:type="dxa" w:w="1242"/>
+          </w:tcPr>
+          <w:p>
+            <w:r>
+              <w:rPr>
+                <w:rFonts w:ascii="宋体" w:hAnsi="宋体" w:eastAsia="宋体"/>
+                <w:b w:val="0"/>
+                <w:sz w:val="19"/>
+              </w:rPr>
+              <w:t>授权项目</w:t>
+            </w:r>
+          </w:p>
+        </w:tc>
+        <w:tc>
+          <w:tcPr>
+            <w:tcW w:type="dxa" w:w="1242"/>
+          </w:tcPr>
+          <w:p>
+            <w:r>
+              <w:rPr>
+                <w:rFonts w:ascii="宋体" w:hAnsi="宋体" w:eastAsia="宋体"/>
+                <w:b w:val="0"/>
+                <w:sz w:val="19"/>
+              </w:rPr>
+              <w:t>否</w:t>
+            </w:r>
+          </w:p>
+        </w:tc>
+        <w:tc>
+          <w:tcPr>
+            <w:tcW w:type="dxa" w:w="1242"/>
+          </w:tcPr>
+          <w:p>
+            <w:r>
+              <w:rPr>
+                <w:rFonts w:ascii="宋体" w:hAnsi="宋体" w:eastAsia="宋体"/>
+                <w:b w:val="0"/>
+                <w:sz w:val="19"/>
+              </w:rPr>
+              <w:t>授权项目</w:t>
+            </w:r>
+          </w:p>
+        </w:tc>
+        <w:tc>
+          <w:tcPr>
+            <w:tcW w:type="dxa" w:w="1242"/>
+          </w:tcPr>
+          <w:p>
+            <w:r>
+              <w:rPr>
+                <w:rFonts w:ascii="宋体" w:hAnsi="宋体" w:eastAsia="宋体"/>
+                <w:b w:val="0"/>
+                <w:sz w:val="19"/>
+              </w:rPr>
+              <w:t>否</w:t>
+            </w:r>
+          </w:p>
+        </w:tc>
+        <w:tc>
+          <w:tcPr>
+            <w:tcW w:type="dxa" w:w="1242"/>
+          </w:tcPr>
+          <w:p>
+            <w:r>
+              <w:rPr>
+                <w:rFonts w:ascii="宋体" w:hAnsi="宋体" w:eastAsia="宋体"/>
+                <w:b w:val="0"/>
+                <w:sz w:val="19"/>
+              </w:rPr>
+              <w:t>按授权</w:t>
+            </w:r>
+          </w:p>
+        </w:tc>
+        <w:tc>
+          <w:tcPr>
+            <w:tcW w:type="dxa" w:w="1242"/>
+          </w:tcPr>
+          <w:p>
+            <w:r>
+              <w:rPr>
+                <w:rFonts w:ascii="宋体" w:hAnsi="宋体" w:eastAsia="宋体"/>
+                <w:b w:val="0"/>
+                <w:sz w:val="19"/>
+              </w:rPr>
+              <w:t>否</w:t>
+            </w:r>
+          </w:p>
+        </w:tc>
+      </w:tr>
+      <w:tr>
+        <w:tc>
+          <w:tcPr>
+            <w:tcW w:type="dxa" w:w="1242"/>
+          </w:tcPr>
+          <w:p>
+            <w:r>
+              <w:rPr>
+                <w:rFonts w:ascii="宋体" w:hAnsi="宋体" w:eastAsia="宋体"/>
+                <w:b w:val="0"/>
+                <w:sz w:val="19"/>
+              </w:rPr>
+              <w:t>复核样本池查看</w:t>
+            </w:r>
+          </w:p>
+        </w:tc>
+        <w:tc>
+          <w:tcPr>
+            <w:tcW w:type="dxa" w:w="1242"/>
+          </w:tcPr>
+          <w:p>
+            <w:r>
+              <w:rPr>
+                <w:rFonts w:ascii="宋体" w:hAnsi="宋体" w:eastAsia="宋体"/>
+                <w:b w:val="0"/>
+                <w:sz w:val="19"/>
+              </w:rPr>
+              <w:t>否</w:t>
+            </w:r>
+          </w:p>
+        </w:tc>
+        <w:tc>
+          <w:tcPr>
+            <w:tcW w:type="dxa" w:w="1242"/>
+          </w:tcPr>
+          <w:p>
+            <w:r>
+              <w:rPr>
+                <w:rFonts w:ascii="宋体" w:hAnsi="宋体" w:eastAsia="宋体"/>
+                <w:b w:val="0"/>
+                <w:sz w:val="19"/>
+              </w:rPr>
+              <w:t>视权限</w:t>
+            </w:r>
+          </w:p>
+        </w:tc>
+        <w:tc>
+          <w:tcPr>
+            <w:tcW w:type="dxa" w:w="1242"/>
+          </w:tcPr>
+          <w:p>
+            <w:r>
+              <w:rPr>
+                <w:rFonts w:ascii="宋体" w:hAnsi="宋体" w:eastAsia="宋体"/>
+                <w:b w:val="0"/>
+                <w:sz w:val="19"/>
+              </w:rPr>
+              <w:t>视权限</w:t>
+            </w:r>
+          </w:p>
+        </w:tc>
+        <w:tc>
+          <w:tcPr>
+            <w:tcW w:type="dxa" w:w="1242"/>
+          </w:tcPr>
+          <w:p>
+            <w:r>
+              <w:rPr>
+                <w:rFonts w:ascii="宋体" w:hAnsi="宋体" w:eastAsia="宋体"/>
+                <w:b w:val="0"/>
+                <w:sz w:val="19"/>
+              </w:rPr>
+              <w:t>视权限</w:t>
+            </w:r>
+          </w:p>
+        </w:tc>
+        <w:tc>
+          <w:tcPr>
+            <w:tcW w:type="dxa" w:w="1242"/>
+          </w:tcPr>
+          <w:p>
+            <w:r>
+              <w:rPr>
+                <w:rFonts w:ascii="宋体" w:hAnsi="宋体" w:eastAsia="宋体"/>
+                <w:b w:val="0"/>
+                <w:sz w:val="19"/>
+              </w:rPr>
+              <w:t>是</w:t>
+            </w:r>
+          </w:p>
+        </w:tc>
+        <w:tc>
+          <w:tcPr>
+            <w:tcW w:type="dxa" w:w="1242"/>
+          </w:tcPr>
+          <w:p>
+            <w:r>
+              <w:rPr>
+                <w:rFonts w:ascii="宋体" w:hAnsi="宋体" w:eastAsia="宋体"/>
+                <w:b w:val="0"/>
+                <w:sz w:val="19"/>
+              </w:rPr>
+              <w:t>是</w:t>
+            </w:r>
+          </w:p>
+        </w:tc>
+        <w:tc>
+          <w:tcPr>
+            <w:tcW w:type="dxa" w:w="1242"/>
+          </w:tcPr>
+          <w:p>
+            <w:r>
+              <w:rPr>
+                <w:rFonts w:ascii="宋体" w:hAnsi="宋体" w:eastAsia="宋体"/>
+                <w:b w:val="0"/>
+                <w:sz w:val="19"/>
+              </w:rPr>
+              <w:t>技术问题样本</w:t>
+            </w:r>
+          </w:p>
+        </w:tc>
+      </w:tr>
+      <w:tr>
+        <w:tc>
+          <w:tcPr>
+            <w:tcW w:type="dxa" w:w="1242"/>
+          </w:tcPr>
+          <w:p>
+            <w:r>
+              <w:rPr>
+                <w:rFonts w:ascii="宋体" w:hAnsi="宋体" w:eastAsia="宋体"/>
+                <w:b w:val="0"/>
+                <w:sz w:val="19"/>
+              </w:rPr>
               <w:t>配置发布/回滚</w:t>
             </w:r>
           </w:p>
@@ -12595,6 +15771,102 @@
                 <w:sz w:val="19"/>
               </w:rPr>
               <w:t>只能查看本人或授权范围内的会话和任务。</w:t>
+            </w:r>
+          </w:p>
+        </w:tc>
+      </w:tr>
+      <w:tr>
+        <w:tc>
+          <w:tcPr>
+            <w:tcW w:type="dxa" w:w="4968"/>
+          </w:tcPr>
+          <w:p>
+            <w:r>
+              <w:rPr>
+                <w:rFonts w:ascii="宋体" w:hAnsi="宋体" w:eastAsia="宋体"/>
+                <w:b w:val="0"/>
+                <w:sz w:val="19"/>
+              </w:rPr>
+              <w:t>人工兜底</w:t>
+            </w:r>
+          </w:p>
+        </w:tc>
+        <w:tc>
+          <w:tcPr>
+            <w:tcW w:type="dxa" w:w="4968"/>
+          </w:tcPr>
+          <w:p>
+            <w:r>
+              <w:rPr>
+                <w:rFonts w:ascii="宋体" w:hAnsi="宋体" w:eastAsia="宋体"/>
+                <w:b w:val="0"/>
+                <w:sz w:val="19"/>
+              </w:rPr>
+              <w:t>校验用户是否有目标项目、结构、表单、附件或批次的处理权限。</w:t>
+            </w:r>
+          </w:p>
+        </w:tc>
+      </w:tr>
+      <w:tr>
+        <w:tc>
+          <w:tcPr>
+            <w:tcW w:type="dxa" w:w="4968"/>
+          </w:tcPr>
+          <w:p>
+            <w:r>
+              <w:rPr>
+                <w:rFonts w:ascii="宋体" w:hAnsi="宋体" w:eastAsia="宋体"/>
+                <w:b w:val="0"/>
+                <w:sz w:val="19"/>
+              </w:rPr>
+              <w:t>人工绑定</w:t>
+            </w:r>
+          </w:p>
+        </w:tc>
+        <w:tc>
+          <w:tcPr>
+            <w:tcW w:type="dxa" w:w="4968"/>
+          </w:tcPr>
+          <w:p>
+            <w:r>
+              <w:rPr>
+                <w:rFonts w:ascii="宋体" w:hAnsi="宋体" w:eastAsia="宋体"/>
+                <w:b w:val="0"/>
+                <w:sz w:val="19"/>
+              </w:rPr>
+              <w:t>目标对象必须来自授权范围内已有基础库，不允许由 AI 自动新增。</w:t>
+            </w:r>
+          </w:p>
+        </w:tc>
+      </w:tr>
+      <w:tr>
+        <w:tc>
+          <w:tcPr>
+            <w:tcW w:type="dxa" w:w="4968"/>
+          </w:tcPr>
+          <w:p>
+            <w:r>
+              <w:rPr>
+                <w:rFonts w:ascii="宋体" w:hAnsi="宋体" w:eastAsia="宋体"/>
+                <w:b w:val="0"/>
+                <w:sz w:val="19"/>
+              </w:rPr>
+              <w:t>复核样本</w:t>
+            </w:r>
+          </w:p>
+        </w:tc>
+        <w:tc>
+          <w:tcPr>
+            <w:tcW w:type="dxa" w:w="4968"/>
+          </w:tcPr>
+          <w:p>
+            <w:r>
+              <w:rPr>
+                <w:rFonts w:ascii="宋体" w:hAnsi="宋体" w:eastAsia="宋体"/>
+                <w:b w:val="0"/>
+                <w:sz w:val="19"/>
+              </w:rPr>
+              <w:t>按项目、角色和敏感等级过滤样本内容，人员信息按最小化原则展示。</w:t>
             </w:r>
           </w:p>
         </w:tc>
@@ -13595,6 +16867,38 @@
                 <w:sz w:val="19"/>
               </w:rPr>
               <w:t>查询 AI 任务、OCR 任务、导出任务状态。</w:t>
+            </w:r>
+          </w:p>
+        </w:tc>
+      </w:tr>
+      <w:tr>
+        <w:tc>
+          <w:tcPr>
+            <w:tcW w:type="dxa" w:w="4968"/>
+          </w:tcPr>
+          <w:p>
+            <w:r>
+              <w:rPr>
+                <w:rFonts w:ascii="宋体" w:hAnsi="宋体" w:eastAsia="宋体"/>
+                <w:b w:val="0"/>
+                <w:sz w:val="19"/>
+              </w:rPr>
+              <w:t>创建/完成人工兜底</w:t>
+            </w:r>
+          </w:p>
+        </w:tc>
+        <w:tc>
+          <w:tcPr>
+            <w:tcW w:type="dxa" w:w="4968"/>
+          </w:tcPr>
+          <w:p>
+            <w:r>
+              <w:rPr>
+                <w:rFonts w:ascii="宋体" w:hAnsi="宋体" w:eastAsia="宋体"/>
+                <w:b w:val="0"/>
+                <w:sz w:val="19"/>
+              </w:rPr>
+              <w:t>记录低置信度、无结果、多候选、识别错误或工具失败后的人工处理过程和最终结果。</w:t>
             </w:r>
           </w:p>
         </w:tc>
@@ -14161,6 +17465,19 @@
           <w:b w:val="0"/>
           <w:sz w:val="21"/>
         </w:rPr>
+        <w:t>人工兜底状态至少包含：待人工确认、待人工补录、待人工绑定、人工处理中、人工处理完成、人工作废。</w:t>
+      </w:r>
+    </w:p>
+    <w:p>
+      <w:pPr>
+        <w:spacing w:before="0" w:after="80" w:line="360" w:lineRule="auto"/>
+      </w:pPr>
+      <w:r>
+        <w:rPr>
+          <w:rFonts w:ascii="宋体" w:hAnsi="宋体" w:eastAsia="宋体"/>
+          <w:b w:val="0"/>
+          <w:sz w:val="21"/>
+        </w:rPr>
         <w:t>OCR 任务状态至少包含：已创建、识别中、待确认、已确认、已填充、失败、已取消。</w:t>
       </w:r>
     </w:p>
@@ -14276,6 +17593,20 @@
     </w:p>
     <w:p>
       <w:pPr>
+        <w:pStyle w:val="ListNumber"/>
+        <w:spacing w:before="0" w:after="80" w:line="360" w:lineRule="auto"/>
+      </w:pPr>
+      <w:r>
+        <w:rPr>
+          <w:rFonts w:ascii="宋体" w:hAnsi="宋体" w:eastAsia="宋体"/>
+          <w:b w:val="0"/>
+          <w:sz w:val="21"/>
+        </w:rPr>
+        <w:t>人在回路路径：覆盖低置信度、多候选、字段缺失、识别错误、工具失败、人工修正、人工补录、人工绑定和转表单手工办理。</w:t>
+      </w:r>
+    </w:p>
+    <w:p>
+      <w:pPr>
         <w:pStyle w:val="Heading2"/>
         <w:jc w:val="left"/>
       </w:pPr>
@@ -14620,6 +17951,20 @@
           <w:sz w:val="21"/>
         </w:rPr>
         <w:t>高风险动作确认拦截、权限拦截、幂等防重复必须通过验收。</w:t>
+      </w:r>
+    </w:p>
+    <w:p>
+      <w:pPr>
+        <w:pStyle w:val="ListNumber"/>
+        <w:spacing w:before="0" w:after="80" w:line="360" w:lineRule="auto"/>
+      </w:pPr>
+      <w:r>
+        <w:rPr>
+          <w:rFonts w:ascii="宋体" w:hAnsi="宋体" w:eastAsia="宋体"/>
+          <w:b w:val="0"/>
+          <w:sz w:val="21"/>
+        </w:rPr>
+        <w:t>低置信度、无结果、字段冲突、多候选和识别错误必须进入人工确认或人工办理路径，不得自动写入最终业务结果。</w:t>
       </w:r>
     </w:p>
     <w:p>
@@ -15458,6 +18803,53 @@
           </w:p>
         </w:tc>
       </w:tr>
+      <w:tr>
+        <w:tc>
+          <w:tcPr>
+            <w:tcW w:type="dxa" w:w="3312"/>
+          </w:tcPr>
+          <w:p>
+            <w:r>
+              <w:rPr>
+                <w:rFonts w:ascii="宋体" w:hAnsi="宋体" w:eastAsia="宋体"/>
+                <w:b w:val="0"/>
+                <w:sz w:val="19"/>
+              </w:rPr>
+              <w:t>AC-011</w:t>
+            </w:r>
+          </w:p>
+        </w:tc>
+        <w:tc>
+          <w:tcPr>
+            <w:tcW w:type="dxa" w:w="3312"/>
+          </w:tcPr>
+          <w:p>
+            <w:r>
+              <w:rPr>
+                <w:rFonts w:ascii="宋体" w:hAnsi="宋体" w:eastAsia="宋体"/>
+                <w:b w:val="0"/>
+                <w:sz w:val="19"/>
+              </w:rPr>
+              <w:t>人在回路</w:t>
+            </w:r>
+          </w:p>
+        </w:tc>
+        <w:tc>
+          <w:tcPr>
+            <w:tcW w:type="dxa" w:w="3312"/>
+          </w:tcPr>
+          <w:p>
+            <w:r>
+              <w:rPr>
+                <w:rFonts w:ascii="宋体" w:hAnsi="宋体" w:eastAsia="宋体"/>
+                <w:b w:val="0"/>
+                <w:sz w:val="19"/>
+              </w:rPr>
+              <w:t>AI 低置信度、无结果、多候选、识别错误、工具失败时，可由用户确认、修正、补录、人工绑定或转人工办理，并形成审计记录。</w:t>
+            </w:r>
+          </w:p>
+        </w:tc>
+      </w:tr>
     </w:tbl>
     <w:p/>
     <w:p>
@@ -15857,6 +19249,147 @@
                 <w:sz w:val="19"/>
               </w:rPr>
               <w:t>展示识别结果、人员/结构候选和附件挂接建议。</w:t>
+            </w:r>
+          </w:p>
+        </w:tc>
+      </w:tr>
+      <w:tr>
+        <w:tc>
+          <w:tcPr>
+            <w:tcW w:type="dxa" w:w="3312"/>
+          </w:tcPr>
+          <w:p>
+            <w:r>
+              <w:rPr>
+                <w:rFonts w:ascii="宋体" w:hAnsi="宋体" w:eastAsia="宋体"/>
+                <w:b w:val="0"/>
+                <w:sz w:val="19"/>
+              </w:rPr>
+              <w:t>验收低置信度</w:t>
+            </w:r>
+          </w:p>
+        </w:tc>
+        <w:tc>
+          <w:tcPr>
+            <w:tcW w:type="dxa" w:w="3312"/>
+          </w:tcPr>
+          <w:p>
+            <w:r>
+              <w:rPr>
+                <w:rFonts w:ascii="宋体" w:hAnsi="宋体" w:eastAsia="宋体"/>
+                <w:b w:val="0"/>
+                <w:sz w:val="19"/>
+              </w:rPr>
+              <w:t>输入含糊验收请求或缺少项目/部位/类型</w:t>
+            </w:r>
+          </w:p>
+        </w:tc>
+        <w:tc>
+          <w:tcPr>
+            <w:tcW w:type="dxa" w:w="3312"/>
+          </w:tcPr>
+          <w:p>
+            <w:r>
+              <w:rPr>
+                <w:rFonts w:ascii="宋体" w:hAnsi="宋体" w:eastAsia="宋体"/>
+                <w:b w:val="0"/>
+                <w:sz w:val="19"/>
+              </w:rPr>
+              <w:t>展示缺失项和可选候选；追问上限后打开半预填或空白验收表单。</w:t>
+            </w:r>
+          </w:p>
+        </w:tc>
+      </w:tr>
+      <w:tr>
+        <w:tc>
+          <w:tcPr>
+            <w:tcW w:type="dxa" w:w="3312"/>
+          </w:tcPr>
+          <w:p>
+            <w:r>
+              <w:rPr>
+                <w:rFonts w:ascii="宋体" w:hAnsi="宋体" w:eastAsia="宋体"/>
+                <w:b w:val="0"/>
+                <w:sz w:val="19"/>
+              </w:rPr>
+              <w:t>检查识别错误</w:t>
+            </w:r>
+          </w:p>
+        </w:tc>
+        <w:tc>
+          <w:tcPr>
+            <w:tcW w:type="dxa" w:w="3312"/>
+          </w:tcPr>
+          <w:p>
+            <w:r>
+              <w:rPr>
+                <w:rFonts w:ascii="宋体" w:hAnsi="宋体" w:eastAsia="宋体"/>
+                <w:b w:val="0"/>
+                <w:sz w:val="19"/>
+              </w:rPr>
+              <w:t>AI 将检查部位、问题类型或责任人识别错误</w:t>
+            </w:r>
+          </w:p>
+        </w:tc>
+        <w:tc>
+          <w:tcPr>
+            <w:tcW w:type="dxa" w:w="3312"/>
+          </w:tcPr>
+          <w:p>
+            <w:r>
+              <w:rPr>
+                <w:rFonts w:ascii="宋体" w:hAnsi="宋体" w:eastAsia="宋体"/>
+                <w:b w:val="0"/>
+                <w:sz w:val="19"/>
+              </w:rPr>
+              <w:t>用户可修改字段并填写原因；最终以用户修改值进入检查记录草稿。</w:t>
+            </w:r>
+          </w:p>
+        </w:tc>
+      </w:tr>
+      <w:tr>
+        <w:tc>
+          <w:tcPr>
+            <w:tcW w:type="dxa" w:w="3312"/>
+          </w:tcPr>
+          <w:p>
+            <w:r>
+              <w:rPr>
+                <w:rFonts w:ascii="宋体" w:hAnsi="宋体" w:eastAsia="宋体"/>
+                <w:b w:val="0"/>
+                <w:sz w:val="19"/>
+              </w:rPr>
+              <w:t>OCR 无匹配对象</w:t>
+            </w:r>
+          </w:p>
+        </w:tc>
+        <w:tc>
+          <w:tcPr>
+            <w:tcW w:type="dxa" w:w="3312"/>
+          </w:tcPr>
+          <w:p>
+            <w:r>
+              <w:rPr>
+                <w:rFonts w:ascii="宋体" w:hAnsi="宋体" w:eastAsia="宋体"/>
+                <w:b w:val="0"/>
+                <w:sz w:val="19"/>
+              </w:rPr>
+              <w:t>桩号、结构或人员无法唯一匹配</w:t>
+            </w:r>
+          </w:p>
+        </w:tc>
+        <w:tc>
+          <w:tcPr>
+            <w:tcW w:type="dxa" w:w="3312"/>
+          </w:tcPr>
+          <w:p>
+            <w:r>
+              <w:rPr>
+                <w:rFonts w:ascii="宋体" w:hAnsi="宋体" w:eastAsia="宋体"/>
+                <w:b w:val="0"/>
+                <w:sz w:val="19"/>
+              </w:rPr>
+              <w:t>用户可选择候选、人工绑定已有对象、标记未匹配或手工挂接附件。</w:t>
             </w:r>
           </w:p>
         </w:tc>
@@ -16000,6 +19533,20 @@
           <w:sz w:val="21"/>
         </w:rPr>
         <w:t>异常兜底样例。</w:t>
+      </w:r>
+    </w:p>
+    <w:p>
+      <w:pPr>
+        <w:pStyle w:val="ListNumber"/>
+        <w:spacing w:before="0" w:after="80" w:line="360" w:lineRule="auto"/>
+      </w:pPr>
+      <w:r>
+        <w:rPr>
+          <w:rFonts w:ascii="宋体" w:hAnsi="宋体" w:eastAsia="宋体"/>
+          <w:b w:val="0"/>
+          <w:sz w:val="21"/>
+        </w:rPr>
+        <w:t>人工兜底样例，包括低置信度触发、人工修正、人工补录、人工绑定、转人工办理和处理完成记录。</w:t>
       </w:r>
     </w:p>
     <w:p>
@@ -17144,6 +20691,53 @@
                 <w:b w:val="0"/>
                 <w:sz w:val="19"/>
               </w:rPr>
+              <w:t>人工兜底链路不完整</w:t>
+            </w:r>
+          </w:p>
+        </w:tc>
+        <w:tc>
+          <w:tcPr>
+            <w:tcW w:type="dxa" w:w="3312"/>
+          </w:tcPr>
+          <w:p>
+            <w:r>
+              <w:rPr>
+                <w:rFonts w:ascii="宋体" w:hAnsi="宋体" w:eastAsia="宋体"/>
+                <w:b w:val="0"/>
+                <w:sz w:val="19"/>
+              </w:rPr>
+              <w:t>低置信度或识别错误后用户无法继续办理</w:t>
+            </w:r>
+          </w:p>
+        </w:tc>
+        <w:tc>
+          <w:tcPr>
+            <w:tcW w:type="dxa" w:w="3312"/>
+          </w:tcPr>
+          <w:p>
+            <w:r>
+              <w:rPr>
+                <w:rFonts w:ascii="宋体" w:hAnsi="宋体" w:eastAsia="宋体"/>
+                <w:b w:val="0"/>
+                <w:sz w:val="19"/>
+              </w:rPr>
+              <w:t>在会话卡片、OCR 确认页和表单草稿页提供候选选择、字段修正、补录、绑定和手工表单入口。</w:t>
+            </w:r>
+          </w:p>
+        </w:tc>
+      </w:tr>
+      <w:tr>
+        <w:tc>
+          <w:tcPr>
+            <w:tcW w:type="dxa" w:w="3312"/>
+          </w:tcPr>
+          <w:p>
+            <w:r>
+              <w:rPr>
+                <w:rFonts w:ascii="宋体" w:hAnsi="宋体" w:eastAsia="宋体"/>
+                <w:b w:val="0"/>
+                <w:sz w:val="19"/>
+              </w:rPr>
               <w:t>配置变更影响生产</w:t>
             </w:r>
           </w:p>
@@ -18088,6 +21682,20 @@
           <w:sz w:val="21"/>
         </w:rPr>
         <w:t>AI 服务异常不得影响人工业务主流程。</w:t>
+      </w:r>
+    </w:p>
+    <w:p>
+      <w:pPr>
+        <w:pStyle w:val="ListNumber"/>
+        <w:spacing w:before="0" w:after="80" w:line="360" w:lineRule="auto"/>
+      </w:pPr>
+      <w:r>
+        <w:rPr>
+          <w:rFonts w:ascii="宋体" w:hAnsi="宋体" w:eastAsia="宋体"/>
+          <w:b w:val="0"/>
+          <w:sz w:val="21"/>
+        </w:rPr>
+        <w:t>AI 无法确定结果、结果置信度低、候选冲突或用户发现识别错误时，必须进入人在回路；用户确认、修正、补录或绑定后的结果作为业务最终输入。</w:t>
       </w:r>
     </w:p>
     <w:p>

</xml_diff>